<commit_message>
Trim review reference list from 53 to 16 core papers
- Keep the 16 academic papers the text discusses by author, model or
  study object (8 agricultural deployment studies, 4 reviews, 3 method
  classics, 1 edge-LLM study); renumber citations by first mention
- Drop citation numbers for datasheets, official docs, product pages,
  statistics, policies and standards; the text already names each of
  these sources, and 4 short attributions were added where it did not
- Re-render figures whose labels carry reference numbers
- Generate 完整来源清单.md listing all 53 sources for traceability
- Update README and refresh the PDF preview

Co-Authored-By: Claude Opus 5.5 <noreply@anthropic.com>
Claude-Session: https://claude.ai/code/session_01JK4iKrTqLt9PYHDYUB7g63
</commit_message>
<xml_diff>
--- a/review/嵌入式端边智能赋能智慧农业综述.docx
+++ b/review/嵌入式端边智能赋能智慧农业综述.docx
@@ -337,61 +337,7 @@
         <w:jc w:val="both"/>
       </w:pPr>
       <w:r>
-        <w:t xml:space="preserve">农业是典型的“数据分散、作业分散”的行业：作物长势、病虫害和环境状态在空间上高度异质，并随季节快速变化，而施药、除草、诱控和采收等动作又必须在田间现场完成。近年来我国农业装备基础持续夯实。据农业农村部统计，2024年全国农作物耕种收综合机械化率达75.64%，植保无人驾驶航空器拥有量达20.1万架</w:t>
-      </w:r>
-      <w:r>
-        <w:rPr>
-          <w:vertAlign w:val="superscript"/>
-        </w:rPr>
-        <w:t xml:space="preserve">[1]</w:t>
-      </w:r>
-      <w:r>
-        <w:t xml:space="preserve">；2025年全国粮食总产量为71488万吨</w:t>
-      </w:r>
-      <w:r>
-        <w:rPr>
-          <w:vertAlign w:val="superscript"/>
-        </w:rPr>
-        <w:t xml:space="preserve">[2]</w:t>
-      </w:r>
-      <w:r>
-        <w:t xml:space="preserve">。然而“机械化”并不等于“智能化”。中央网信办2024年刊文援引的数据显示，我国农业生产信息化率为27.6%</w:t>
-      </w:r>
-      <w:r>
-        <w:rPr>
-          <w:vertAlign w:val="superscript"/>
-        </w:rPr>
-        <w:t xml:space="preserve">[3]</w:t>
-      </w:r>
-      <w:r>
-        <w:t xml:space="preserve">；《全国智慧农业行动计划（2024—2028年）》提出到2026年底、2028年底分别达到30%以上和32%以上</w:t>
-      </w:r>
-      <w:r>
-        <w:rPr>
-          <w:vertAlign w:val="superscript"/>
-        </w:rPr>
-        <w:t xml:space="preserve">[4]</w:t>
-      </w:r>
-      <w:r>
-        <w:t xml:space="preserve">，《农业农村部关于大力发展智慧农业的指导意见》进一步提出2030年达到35%左右、2035年达到40%以上，要求“着力破解信息感知、智能决策、精准作业各环节的瓶颈问题”，并加快农业传感器与专用芯片、农业核心算法、农业机器人等关键核心技术攻关</w:t>
-      </w:r>
-      <w:r>
-        <w:rPr>
-          <w:vertAlign w:val="superscript"/>
-        </w:rPr>
-        <w:t xml:space="preserve">[5]</w:t>
-      </w:r>
-      <w:r>
-        <w:t xml:space="preserve">。国外也呈现类似格局：美国农业部2025年的调查显示，85%的农场具备互联网接入，但报告在过去一年使用精准农业实践的农场仅占22%（2023年为27%）</w:t>
-      </w:r>
-      <w:r>
-        <w:rPr>
-          <w:vertAlign w:val="superscript"/>
-        </w:rPr>
-        <w:t xml:space="preserve">[6]</w:t>
-      </w:r>
-      <w:r>
-        <w:t xml:space="preserve">。可见，农业智能化的瓶颈并不只在于“有没有网络和算力”，更在于能否把感知、决策与执行可靠地落到作业现场。</w:t>
+        <w:t xml:space="preserve">农业是典型的“数据分散、作业分散”的行业：作物长势、病虫害和环境状态在空间上高度异质，并随季节快速变化，而施药、除草、诱控和采收等动作又必须在田间现场完成。近年来我国农业装备基础持续夯实。据农业农村部统计，2024年全国农作物耕种收综合机械化率达75.64%，植保无人驾驶航空器拥有量达20.1万架；据国家统计局公告，2025年全国粮食总产量为71488万吨。然而“机械化”并不等于“智能化”。中央网信办2024年刊文援引的数据显示，我国农业生产信息化率为27.6%；《全国智慧农业行动计划（2024—2028年）》提出到2026年底、2028年底分别达到30%以上和32%以上，《农业农村部关于大力发展智慧农业的指导意见》进一步提出2030年达到35%左右、2035年达到40%以上，要求“着力破解信息感知、智能决策、精准作业各环节的瓶颈问题”，并加快农业传感器与专用芯片、农业核心算法、农业机器人等关键核心技术攻关。国外也呈现类似格局：美国农业部2025年的调查显示，85%的农场具备互联网接入，但报告在过去一年使用精准农业实践的农场仅占22%（2023年为27%）。可见，农业智能化的瓶颈并不只在于“有没有网络和算力”，更在于能否把感知、决策与执行可靠地落到作业现场。</w:t>
       </w:r>
     </w:p>
     <w:p>
@@ -409,49 +355,31 @@
         <w:jc w:val="both"/>
       </w:pPr>
       <w:r>
-        <w:t xml:space="preserve">深度学习使作物病害识别、杂草检测和果实计数等视觉任务的准确率大幅提升，但早期系统多采用“终端采集—云端推理—结果回传”的模式，在农业现场面临四方面约束。其一是实时性：以约翰迪尔（John Deere）的See &amp; Spray靶向喷雾系统为例，喷杆摄像头在最高约15 mph的行驶速度下每秒扫描超过2100平方英尺作物，由机载处理器逐株判别作物与杂草并直接控制单个喷嘴</w:t>
+        <w:t xml:space="preserve">深度学习使作物病害识别、杂草检测和果实计数等视觉任务的准确率大幅提升，但早期系统多采用“终端采集—云端推理—结果回传”的模式，在农业现场面临四方面约束。其一是实时性：以约翰迪尔（John Deere）的See &amp; Spray靶向喷雾系统为例，据厂商介绍，其喷杆摄像头在最高约15 mph的行驶速度下每秒扫描超过2100平方英尺作物，由机载处理器逐株判别作物与杂草并直接控制单个喷嘴，判别必须在喷头经过目标之前完成，云端往返难以满足。其二是带宽：田间常用的LoRaWAN等低功耗广域网单帧应用载荷仅为数十至两百余字节，连续视频不可能全量回传。其三是可靠性：地形遮挡、土壤介电特性变化和农机振动都会造成通信丢包</w:t>
       </w:r>
       <w:r>
         <w:rPr>
           <w:vertAlign w:val="superscript"/>
         </w:rPr>
-        <w:t xml:space="preserve">[7]</w:t>
-      </w:r>
-      <w:r>
-        <w:t xml:space="preserve">，判别必须在喷头经过目标之前完成，云端往返难以满足。其二是带宽：田间常用的LoRaWAN等低功耗广域网单帧应用载荷仅为数十至两百余字节</w:t>
+        <w:t xml:space="preserve">[1]</w:t>
+      </w:r>
+      <w:r>
+        <w:t xml:space="preserve">，作业不能因断网而中止。其四是能源与数据主权：野外节点常依赖电池或太阳能供电，原始影像也包含农场经营信息。因此，将推理下沉到嵌入式终端（端侧）或靠近数据源的场边节点（边缘侧），形成“端侧实时感知与控制、边缘汇聚与协同、云端训练与管理”的分工，成为近年研究的主线</w:t>
       </w:r>
       <w:r>
         <w:rPr>
           <w:vertAlign w:val="superscript"/>
         </w:rPr>
-        <w:t xml:space="preserve">[8]</w:t>
-      </w:r>
-      <w:r>
-        <w:t xml:space="preserve">，连续视频不可能全量回传。其三是可靠性：地形遮挡、土壤介电特性变化和农机振动都会造成通信丢包</w:t>
+        <w:t xml:space="preserve">[1,2]</w:t>
+      </w:r>
+      <w:r>
+        <w:t xml:space="preserve">。需要强调的是，端边智能并不排斥云：模型训练、跨地块数据汇聚和农业知识服务仍需要云端支撑</w:t>
       </w:r>
       <w:r>
         <w:rPr>
           <w:vertAlign w:val="superscript"/>
         </w:rPr>
-        <w:t xml:space="preserve">[9]</w:t>
-      </w:r>
-      <w:r>
-        <w:t xml:space="preserve">，作业不能因断网而中止。其四是能源与数据主权：野外节点常依赖电池或太阳能供电，原始影像也包含农场经营信息。因此，将推理下沉到嵌入式终端（端侧）或靠近数据源的场边节点（边缘侧），形成“端侧实时感知与控制、边缘汇聚与协同、云端训练与管理”的分工，成为近年研究的主线</w:t>
-      </w:r>
-      <w:r>
-        <w:rPr>
-          <w:vertAlign w:val="superscript"/>
-        </w:rPr>
-        <w:t xml:space="preserve">[9–11]</w:t>
-      </w:r>
-      <w:r>
-        <w:t xml:space="preserve">。需要强调的是，端边智能并不排斥云：模型训练、跨地块数据汇聚和农业知识服务仍需要云端支撑</w:t>
-      </w:r>
-      <w:r>
-        <w:rPr>
-          <w:vertAlign w:val="superscript"/>
-        </w:rPr>
-        <w:t xml:space="preserve">[12]</w:t>
+        <w:t xml:space="preserve">[3]</w:t>
       </w:r>
       <w:r>
         <w:t xml:space="preserve">。</w:t>
@@ -464,16 +392,7 @@
         <w:jc w:val="both"/>
       </w:pPr>
       <w:r>
-        <w:t xml:space="preserve">与之呼应，边缘计算产业整体快速增长。IDC在2024年发布的预测中估计，当年全球边缘计算支出约2320亿美元，2027年将接近3500亿美元</w:t>
-      </w:r>
-      <w:r>
-        <w:rPr>
-          <w:vertAlign w:val="superscript"/>
-        </w:rPr>
-        <w:t xml:space="preserve">[13]</w:t>
-      </w:r>
-      <w:r>
-        <w:t xml:space="preserve">。但这一数字覆盖全行业的硬件、软件与服务，并非农业端侧AI的市场规模，本文仅将其作为技术背景。</w:t>
+        <w:t xml:space="preserve">与之呼应，边缘计算产业整体快速增长。IDC在2024年发布的预测中估计，当年全球边缘计算支出约2320亿美元，2027年将接近3500亿美元。但这一数字覆盖全行业的硬件、软件与服务，并非农业端侧AI的市场规模，本文仅将其作为技术背景。</w:t>
       </w:r>
     </w:p>
     <w:p>
@@ -623,79 +542,7 @@
         <w:t xml:space="preserve">表1</w:t>
       </w:r>
       <w:r>
-        <w:t xml:space="preserve">）。第一档是微控制器（MCU）。以乐鑫ESP32-S3为例，其集成双核Xtensa LX7处理器（最高240 MHz）和512 KB片上SRAM，并提供可用于神经网络运算的向量指令，但没有独立的NPU</w:t>
-      </w:r>
-      <w:r>
-        <w:rPr>
-          <w:vertAlign w:val="superscript"/>
-        </w:rPr>
-        <w:t xml:space="preserve">[14]</w:t>
-      </w:r>
-      <w:r>
-        <w:t xml:space="preserve">；意法半导体2024年发布的STM32N6则在Cortex-M55内核（最高800 MHz）旁集成了自研的Neural-ART加速器，标称600 GOPS，片上RAM达4.2 MB，是其首款集成NPU的MCU</w:t>
-      </w:r>
-      <w:r>
-        <w:rPr>
-          <w:vertAlign w:val="superscript"/>
-        </w:rPr>
-        <w:t xml:space="preserve">[15,16]</w:t>
-      </w:r>
-      <w:r>
-        <w:t xml:space="preserve">。这一档适合电池供电的传感节点、虫情测报终端等低分辨率、低帧率任务。第二档是嵌入式SoC与单板计算机，如集成Ethos-U65微NPU的恩智浦i.MX 93</w:t>
-      </w:r>
-      <w:r>
-        <w:rPr>
-          <w:vertAlign w:val="superscript"/>
-        </w:rPr>
-        <w:t xml:space="preserve">[17]</w:t>
-      </w:r>
-      <w:r>
-        <w:t xml:space="preserve">、标称6 TOPS NPU的瑞芯微RK3588</w:t>
-      </w:r>
-      <w:r>
-        <w:rPr>
-          <w:vertAlign w:val="superscript"/>
-        </w:rPr>
-        <w:t xml:space="preserve">[18]</w:t>
-      </w:r>
-      <w:r>
-        <w:t xml:space="preserve">，以及本身不带NPU、需外接加速器的树莓派5</w:t>
-      </w:r>
-      <w:r>
-        <w:rPr>
-          <w:vertAlign w:val="superscript"/>
-        </w:rPr>
-        <w:t xml:space="preserve">[19]</w:t>
-      </w:r>
-      <w:r>
-        <w:t xml:space="preserve">；它们可运行嵌入式Linux，适合田间网关、智能相机和小型机器人。第三档是边缘GPU与专用加速器：Jetson Orin NX 16GB在普通模式下标称100 TOPS（INT8稀疏，稠密为50 TOPS），在MAXN_SUPER模式下为157 TOPS（稠密78 TOPS），模块功耗档为10—40 W</w:t>
-      </w:r>
-      <w:r>
-        <w:rPr>
-          <w:vertAlign w:val="superscript"/>
-        </w:rPr>
-        <w:t xml:space="preserve">[20]</w:t>
-      </w:r>
-      <w:r>
-        <w:t xml:space="preserve">；Orin Nano Super开发套件标称67 INT8 TOPS、功耗7—25 W</w:t>
-      </w:r>
-      <w:r>
-        <w:rPr>
-          <w:vertAlign w:val="superscript"/>
-        </w:rPr>
-        <w:t xml:space="preserve">[21,22]</w:t>
-      </w:r>
-      <w:r>
-        <w:t xml:space="preserve">；Hailo-8L为13 TOPS、芯片典型功耗1.5 W</w:t>
-      </w:r>
-      <w:r>
-        <w:rPr>
-          <w:vertAlign w:val="superscript"/>
-        </w:rPr>
-        <w:t xml:space="preserve">[23]</w:t>
-      </w:r>
-      <w:r>
-        <w:t xml:space="preserve">。这一档可承担多路高分辨率视频检测，常用于植保机械、除草机器人和场边服务器。</w:t>
+        <w:t xml:space="preserve">）。第一档是微控制器（MCU）。以乐鑫ESP32-S3为例，其集成双核Xtensa LX7处理器（最高240 MHz）和512 KB片上SRAM，并提供可用于神经网络运算的向量指令，但没有独立的NPU；意法半导体2024年发布的STM32N6则在Cortex-M55内核（最高800 MHz）旁集成了自研的Neural-ART加速器，标称600 GOPS，片上RAM达4.2 MB，是其首款集成NPU的MCU。这一档适合电池供电的传感节点、虫情测报终端等低分辨率、低帧率任务。第二档是嵌入式SoC与单板计算机，如集成Ethos-U65微NPU的恩智浦i.MX 93、标称6 TOPS NPU的瑞芯微RK3588，以及本身不带NPU、需外接加速器的树莓派5；它们可运行嵌入式Linux，适合田间网关、智能相机和小型机器人。第三档是边缘GPU与专用加速器：Jetson Orin NX 16GB在普通模式下标称100 TOPS（INT8稀疏，稠密为50 TOPS），在MAXN_SUPER模式下为157 TOPS（稠密78 TOPS），模块功耗档为10—40 W；Orin Nano Super开发套件标称67 INT8 TOPS、功耗7—25 W；Hailo-8L为13 TOPS、芯片典型功耗1.5 W。这一档可承担多路高分辨率视频检测，常用于植保机械、除草机器人和场边服务器。</w:t>
       </w:r>
     </w:p>
     <w:p>
@@ -708,19 +555,10 @@
         <w:t xml:space="preserve">阅读硬件参数时有两点尤其重要。第一，TOPS必须与数值精度、稀疏性和功耗模式一同解读：同一模块的“稀疏峰值”可以是“稠密值”的两倍，更不能把最高算力与最低功耗档组合出并不存在的能效。第二，功耗必须说明测量边界：Hailo-8L的1.5 W是芯片典型值，而文献</w:t>
       </w:r>
       <w:r>
-        <w:t xml:space="preserve">[24]</w:t>
-      </w:r>
-      <w:r>
-        <w:t xml:space="preserve">在树莓派5加Hailo-8L的系统输入端实测功耗为5.4—7.2 W；树莓派5的5 V/5 A只是供电规格而非运行功耗</w:t>
-      </w:r>
-      <w:r>
-        <w:rPr>
-          <w:vertAlign w:val="superscript"/>
-        </w:rPr>
-        <w:t xml:space="preserve">[19]</w:t>
-      </w:r>
-      <w:r>
-        <w:t xml:space="preserve">。因此，硬件选型应从任务出发：单点传感分类可在MCU上完成，多相机实时检测则需要GPU或专用加速器，而不是一味追求更高的峰值算力。</w:t>
+        <w:t xml:space="preserve">[4]</w:t>
+      </w:r>
+      <w:r>
+        <w:t xml:space="preserve">在树莓派5加Hailo-8L的系统输入端实测功耗为5.4—7.2 W；树莓派5的5 V/5 A只是供电规格而非运行功耗。因此，硬件选型应从任务出发：单点传感分类可在MCU上完成，多相机实时检测则需要GPU或专用加速器，而不是一味追求更高的峰值算力。</w:t>
       </w:r>
     </w:p>
     <w:p>
@@ -808,7 +646,7 @@
           <w:sz w:val="18"/>
           <w:szCs w:val="18"/>
         </w:rPr>
-        <w:t xml:space="preserve">自绘。数据来自各厂商官方资料</w:t>
+        <w:t xml:space="preserve">自绘。数据来自各厂商官网产品页与数据手册（2026年9月访问）及文献</w:t>
       </w:r>
       <w:r>
         <w:rPr>
@@ -816,23 +654,7 @@
           <w:sz w:val="18"/>
           <w:szCs w:val="18"/>
         </w:rPr>
-        <w:t xml:space="preserve">[14,15,17–21,23]</w:t>
-      </w:r>
-      <w:r>
-        <w:rPr>
-          <w:color w:val="595959"/>
-          <w:sz w:val="18"/>
-          <w:szCs w:val="18"/>
-        </w:rPr>
-        <w:t xml:space="preserve">与文献</w:t>
-      </w:r>
-      <w:r>
-        <w:rPr>
-          <w:color w:val="595959"/>
-          <w:sz w:val="18"/>
-          <w:szCs w:val="18"/>
-        </w:rPr>
-        <w:t xml:space="preserve">[24]</w:t>
+        <w:t xml:space="preserve">[4]</w:t>
       </w:r>
       <w:r>
         <w:rPr>
@@ -1348,7 +1170,7 @@
                 <w:sz w:val="18"/>
                 <w:szCs w:val="18"/>
               </w:rPr>
-              <w:t xml:space="preserve">[25]</w:t>
+              <w:t xml:space="preserve">[5]</w:t>
             </w:r>
           </w:p>
         </w:tc>
@@ -2243,7 +2065,7 @@
                 <w:sz w:val="18"/>
                 <w:szCs w:val="18"/>
               </w:rPr>
-              <w:t xml:space="preserve">[26]</w:t>
+              <w:t xml:space="preserve">[6]</w:t>
             </w:r>
             <w:r>
               <w:rPr>
@@ -2257,7 +2079,7 @@
                 <w:sz w:val="18"/>
                 <w:szCs w:val="18"/>
               </w:rPr>
-              <w:t xml:space="preserve">[24]</w:t>
+              <w:t xml:space="preserve">[4]</w:t>
             </w:r>
           </w:p>
         </w:tc>
@@ -2424,7 +2246,7 @@
                 <w:sz w:val="18"/>
                 <w:szCs w:val="18"/>
               </w:rPr>
-              <w:t xml:space="preserve">[24]</w:t>
+              <w:t xml:space="preserve">[4]</w:t>
             </w:r>
           </w:p>
         </w:tc>
@@ -2493,7 +2315,7 @@
                 <w:sz w:val="18"/>
                 <w:szCs w:val="18"/>
               </w:rPr>
-              <w:t xml:space="preserve">[24]</w:t>
+              <w:t xml:space="preserve">[4]</w:t>
             </w:r>
           </w:p>
         </w:tc>
@@ -2944,7 +2766,7 @@
                 <w:sz w:val="18"/>
                 <w:szCs w:val="18"/>
               </w:rPr>
-              <w:t xml:space="preserve">[27]</w:t>
+              <w:t xml:space="preserve">[7]</w:t>
             </w:r>
           </w:p>
         </w:tc>
@@ -2961,23 +2783,7 @@
           <w:sz w:val="18"/>
           <w:szCs w:val="18"/>
         </w:rPr>
-        <w:t xml:space="preserve">注：数据来源：厂商官方资料</w:t>
-      </w:r>
-      <w:r>
-        <w:rPr>
-          <w:color w:val="595959"/>
-          <w:sz w:val="18"/>
-          <w:szCs w:val="18"/>
-        </w:rPr>
-        <w:t xml:space="preserve">[14–23]</w:t>
-      </w:r>
-      <w:r>
-        <w:rPr>
-          <w:color w:val="595959"/>
-          <w:sz w:val="18"/>
-          <w:szCs w:val="18"/>
-        </w:rPr>
-        <w:t xml:space="preserve">。“未公开”表示所核官方资料未给出统一数值，不代表为零；不同行的算力与功耗口径不同，不宜直接计算能效比。</w:t>
+        <w:t xml:space="preserve">注：数据来源：各厂商官网产品页与数据手册（乐鑫、意法半导体、恩智浦、瑞芯微、树莓派、Hailo、NVIDIA，2026年9月访问）。“未公开”表示所核官方资料未给出统一数值，不代表为零；不同行的算力与功耗口径不同，不宜直接计算能效比。</w:t>
       </w:r>
     </w:p>
     <w:p>
@@ -3001,49 +2807,31 @@
         <w:t xml:space="preserve">图3</w:t>
       </w:r>
       <w:r>
-        <w:t xml:space="preserve">）。在参数/数值层，量化把32位浮点权重和激活转换为8位甚至更低位宽的整数，使推理可以只用整数运算完成</w:t>
+        <w:t xml:space="preserve">）。在参数/数值层，量化把32位浮点权重和激活转换为8位甚至更低位宽的整数，使推理可以只用整数运算完成；剪枝去除冗余连接或通道，Deep Compression将剪枝、训练量化和霍夫曼编码串联，在不损失准确率的前提下把AlexNet从240 MB压缩到6.9 MB、把VGG-16从552 MB压缩到11.3 MB</w:t>
       </w:r>
       <w:r>
         <w:rPr>
           <w:vertAlign w:val="superscript"/>
         </w:rPr>
-        <w:t xml:space="preserve">[28]</w:t>
-      </w:r>
-      <w:r>
-        <w:t xml:space="preserve">；剪枝去除冗余连接或通道，Deep Compression将剪枝、训练量化和霍夫曼编码串联，在不损失准确率的前提下把AlexNet从240 MB压缩到6.9 MB、把VGG-16从552 MB压缩到11.3 MB</w:t>
+        <w:t xml:space="preserve">[8]</w:t>
+      </w:r>
+      <w:r>
+        <w:t xml:space="preserve">。在知识层，知识蒸馏让小型学生网络学习大型教师网络输出中蕴含的类别关系，天然契合“云端训练教师、端侧部署学生”的农业场景。在结构层，MobileNetV3借助硬件感知的网络结构搜索（NAS）与NetAdapt优化网络，作者报告其Large版本比MobileNetV2准确率提高3.2%、延迟降低15%</w:t>
       </w:r>
       <w:r>
         <w:rPr>
           <w:vertAlign w:val="superscript"/>
         </w:rPr>
-        <w:t xml:space="preserve">[29]</w:t>
-      </w:r>
-      <w:r>
-        <w:t xml:space="preserve">。在知识层，知识蒸馏让小型学生网络学习大型教师网络输出中蕴含的类别关系</w:t>
+        <w:t xml:space="preserve">[9]</w:t>
+      </w:r>
+      <w:r>
+        <w:t xml:space="preserve">。在执行层，MCUNet联合设计TinyNAS与推理引擎TinyEngine，在商用MCU上实现了超过70%的ImageNet Top-1准确率，峰值内存较对比方案降低3.4倍，推理加速1.7—3.3倍</w:t>
       </w:r>
       <w:r>
         <w:rPr>
           <w:vertAlign w:val="superscript"/>
         </w:rPr>
-        <w:t xml:space="preserve">[30]</w:t>
-      </w:r>
-      <w:r>
-        <w:t xml:space="preserve">，天然契合“云端训练教师、端侧部署学生”的农业场景。在结构层，MobileNetV3借助硬件感知的网络结构搜索（NAS）与NetAdapt优化网络，作者报告其Large版本比MobileNetV2准确率提高3.2%、延迟降低15%</w:t>
-      </w:r>
-      <w:r>
-        <w:rPr>
-          <w:vertAlign w:val="superscript"/>
-        </w:rPr>
-        <w:t xml:space="preserve">[31]</w:t>
-      </w:r>
-      <w:r>
-        <w:t xml:space="preserve">。在执行层，MCUNet联合设计TinyNAS与推理引擎TinyEngine，在商用MCU上实现了超过70%的ImageNet Top-1准确率，峰值内存较对比方案降低3.4倍，推理加速1.7—3.3倍</w:t>
-      </w:r>
-      <w:r>
-        <w:rPr>
-          <w:vertAlign w:val="superscript"/>
-        </w:rPr>
-        <w:t xml:space="preserve">[32]</w:t>
+        <w:t xml:space="preserve">[10]</w:t>
       </w:r>
       <w:r>
         <w:t xml:space="preserve">。</w:t>
@@ -3062,7 +2850,7 @@
         <w:rPr>
           <w:vertAlign w:val="superscript"/>
         </w:rPr>
-        <w:t xml:space="preserve">[26]</w:t>
+        <w:t xml:space="preserve">[6]</w:t>
       </w:r>
       <w:r>
         <w:t xml:space="preserve">；YOLO-PLNet相对基线YOLO11n参数量减少18.07%、计算量减少16.92%</w:t>
@@ -3071,7 +2859,7 @@
         <w:rPr>
           <w:vertAlign w:val="superscript"/>
         </w:rPr>
-        <w:t xml:space="preserve">[27]</w:t>
+        <w:t xml:space="preserve">[7]</w:t>
       </w:r>
       <w:r>
         <w:t xml:space="preserve">；水稻害虫检测研究在YOLOv13中引入GhostConv等轻量模块，作者报告精度提高0.7%、速度提高19.6%</w:t>
@@ -3080,7 +2868,7 @@
         <w:rPr>
           <w:vertAlign w:val="superscript"/>
         </w:rPr>
-        <w:t xml:space="preserve">[33]</w:t>
+        <w:t xml:space="preserve">[11]</w:t>
       </w:r>
       <w:r>
         <w:t xml:space="preserve">。需要注意，各层收益作用在不同指标上：文件变小主要节省存储与分发流量，FLOPs减少不一定带来同比例的实测提速，非结构化稀疏若缺乏硬件支持反而可能增加索引开销</w:t>
@@ -3089,7 +2877,7 @@
         <w:rPr>
           <w:vertAlign w:val="superscript"/>
         </w:rPr>
-        <w:t xml:space="preserve">[29]</w:t>
+        <w:t xml:space="preserve">[8]</w:t>
       </w:r>
       <w:r>
         <w:t xml:space="preserve">。轻量化效果最终必须在目标硬件上、以相同的输入尺寸和数值精度重新测量。</w:t>
@@ -3188,7 +2976,7 @@
           <w:sz w:val="18"/>
           <w:szCs w:val="18"/>
         </w:rPr>
-        <w:t xml:space="preserve">[28–32]</w:t>
+        <w:t xml:space="preserve">[8–10]</w:t>
       </w:r>
       <w:r>
         <w:rPr>
@@ -3204,7 +2992,7 @@
           <w:sz w:val="18"/>
           <w:szCs w:val="18"/>
         </w:rPr>
-        <w:t xml:space="preserve">[24,26,27,33]</w:t>
+        <w:t xml:space="preserve">[4,6,7,11]</w:t>
       </w:r>
       <w:r>
         <w:rPr>
@@ -3236,52 +3024,7 @@
         <w:t xml:space="preserve">图4</w:t>
       </w:r>
       <w:r>
-        <w:t xml:space="preserve">）。通常先把PyTorch或TensorFlow模型导出为ONNX或TFLite等中间表示，再按目标硬件分支处理。MCU路线可使用LiteRT for Microcontrollers（原TensorFlow Lite Micro），其核心运行时仅约16 KB量级，但模型权重、张量工作区和摄像头缓冲需另行计入</w:t>
-      </w:r>
-      <w:r>
-        <w:rPr>
-          <w:vertAlign w:val="superscript"/>
-        </w:rPr>
-        <w:t xml:space="preserve">[34]</w:t>
-      </w:r>
-      <w:r>
-        <w:t xml:space="preserve">，并可调用Arm CMSIS-NN等针对Cortex-M优化的算子内核</w:t>
-      </w:r>
-      <w:r>
-        <w:rPr>
-          <w:vertAlign w:val="superscript"/>
-        </w:rPr>
-        <w:t xml:space="preserve">[35]</w:t>
-      </w:r>
-      <w:r>
-        <w:t xml:space="preserve">。嵌入式SoC一般依赖厂商NPU工具链，把模型量化并编译为NPU可执行文件。ONNX Runtime通过Execution Provider机制接入TensorRT、OpenVINO等不同硬件后端，不受支持的算子会回退到CPU执行</w:t>
-      </w:r>
-      <w:r>
-        <w:rPr>
-          <w:vertAlign w:val="superscript"/>
-        </w:rPr>
-        <w:t xml:space="preserve">[36]</w:t>
-      </w:r>
-      <w:r>
-        <w:t xml:space="preserve">；在NVIDIA平台上，TensorRT支持FP16降精度推理与INT8等量化推理，可通过校准（隐式量化）或插入量化/反量化节点（显式量化）生成优化引擎</w:t>
-      </w:r>
-      <w:r>
-        <w:rPr>
-          <w:vertAlign w:val="superscript"/>
-        </w:rPr>
-        <w:t xml:space="preserve">[37]</w:t>
-      </w:r>
-      <w:r>
-        <w:t xml:space="preserve">；Intel平台则可使用OpenVINO</w:t>
-      </w:r>
-      <w:r>
-        <w:rPr>
-          <w:vertAlign w:val="superscript"/>
-        </w:rPr>
-        <w:t xml:space="preserve">[38]</w:t>
-      </w:r>
-      <w:r>
-        <w:t xml:space="preserve">。</w:t>
+        <w:t xml:space="preserve">）。通常先把PyTorch或TensorFlow模型导出为ONNX或TFLite等中间表示，再按目标硬件分支处理。MCU路线可使用LiteRT for Microcontrollers（原TensorFlow Lite Micro），其核心运行时仅约16 KB量级，但模型权重、张量工作区和摄像头缓冲需另行计入，并可调用Arm CMSIS-NN等针对Cortex-M优化的算子内核。嵌入式SoC一般依赖厂商NPU工具链，把模型量化并编译为NPU可执行文件。ONNX Runtime通过Execution Provider机制接入TensorRT、OpenVINO等不同硬件后端，不受支持的算子会回退到CPU执行；在NVIDIA平台上，TensorRT支持FP16降精度推理与INT8等量化推理，可通过校准（隐式量化）或插入量化/反量化节点（显式量化）生成优化引擎；Intel平台则可使用OpenVINO。</w:t>
       </w:r>
     </w:p>
     <w:p>
@@ -3297,7 +3040,7 @@
         <w:rPr>
           <w:vertAlign w:val="superscript"/>
         </w:rPr>
-        <w:t xml:space="preserve">[27]</w:t>
+        <w:t xml:space="preserve">[7]</w:t>
       </w:r>
       <w:r>
         <w:t xml:space="preserve">。杂草检测研究则把YOLOv8/v10/v11模型以固定输入尺寸（1×3×640×640）导出为ONNX，经Hailo Dataflow Compiler进行训练后量化（PTQ）——权重按通道对称量化、激活按张量非对称量化，校准使用全部2235张训练图像——生成HEF文件，再由HailoRT与GStreamer流水线执行（</w:t>
@@ -3312,7 +3055,7 @@
         <w:rPr>
           <w:vertAlign w:val="superscript"/>
         </w:rPr>
-        <w:t xml:space="preserve">[24]</w:t>
+        <w:t xml:space="preserve">[4]</w:t>
       </w:r>
       <w:r>
         <w:t xml:space="preserve">。作者报告，转换为HEF后所有模型的F1值均下降约0.03—0.18</w:t>
@@ -3321,19 +3064,10 @@
         <w:rPr>
           <w:vertAlign w:val="superscript"/>
         </w:rPr>
-        <w:t xml:space="preserve">[24]</w:t>
-      </w:r>
-      <w:r>
-        <w:t xml:space="preserve">，说明量化编译并不是“无损”的格式转换，必须重新评估精度。此外，若模型含有目标NPU不支持的算子，这部分计算会退回CPU，实际加速可能远低于预期，这也是部署前需要逐层检查的问题</w:t>
-      </w:r>
-      <w:r>
-        <w:rPr>
-          <w:vertAlign w:val="superscript"/>
-        </w:rPr>
-        <w:t xml:space="preserve">[10,36]</w:t>
-      </w:r>
-      <w:r>
-        <w:t xml:space="preserve">。</w:t>
+        <w:t xml:space="preserve">[4]</w:t>
+      </w:r>
+      <w:r>
+        <w:t xml:space="preserve">，说明量化编译并不是“无损”的格式转换，必须重新评估精度。此外，若模型含有目标NPU不支持的算子，这部分计算会退回CPU，实际加速可能远低于预期，这也是部署前需要逐层检查的问题。</w:t>
       </w:r>
     </w:p>
     <w:p>
@@ -3421,7 +3155,7 @@
           <w:sz w:val="18"/>
           <w:szCs w:val="18"/>
         </w:rPr>
-        <w:t xml:space="preserve">自绘。依据LiteRT、ONNX Runtime、TensorRT、ESP-IDF OTA等官方文档</w:t>
+        <w:t xml:space="preserve">自绘。依据LiteRT、ONNX Runtime、TensorRT、ESP-IDF等官方文档及文献</w:t>
       </w:r>
       <w:r>
         <w:rPr>
@@ -3429,23 +3163,7 @@
           <w:sz w:val="18"/>
           <w:szCs w:val="18"/>
         </w:rPr>
-        <w:t xml:space="preserve">[34,36,37,39]</w:t>
-      </w:r>
-      <w:r>
-        <w:rPr>
-          <w:color w:val="595959"/>
-          <w:sz w:val="18"/>
-          <w:szCs w:val="18"/>
-        </w:rPr>
-        <w:t xml:space="preserve">及文献</w:t>
-      </w:r>
-      <w:r>
-        <w:rPr>
-          <w:color w:val="595959"/>
-          <w:sz w:val="18"/>
-          <w:szCs w:val="18"/>
-        </w:rPr>
-        <w:t xml:space="preserve">[24,27]</w:t>
+        <w:t xml:space="preserve">[4,7]</w:t>
       </w:r>
       <w:r>
         <w:rPr>
@@ -3549,7 +3267,7 @@
           <w:sz w:val="18"/>
           <w:szCs w:val="18"/>
         </w:rPr>
-        <w:t xml:space="preserve">[24]</w:t>
+        <w:t xml:space="preserve">[4]</w:t>
       </w:r>
       <w:r>
         <w:rPr>
@@ -3581,22 +3299,13 @@
         <w:t xml:space="preserve">图6</w:t>
       </w:r>
       <w:r>
-        <w:t xml:space="preserve">）。资源预算也必须覆盖整条链：在MCU上，模型权重通常存放在Flash中，推理所需的张量工作区（tensor arena）、摄像头帧缓冲和各任务栈则共同占用有限的SRAM。例如，ESP32-S3的片上SRAM为512 KB</w:t>
+        <w:t xml:space="preserve">）。资源预算也必须覆盖整条链：在MCU上，模型权重通常存放在Flash中，推理所需的张量工作区（tensor arena）、摄像头帧缓冲和各任务栈则共同占用有限的SRAM。例如，ESP32-S3的片上SRAM为512 KB，而一项番茄病害TinyML研究报告模型运行占用1.1 MB RAM</w:t>
       </w:r>
       <w:r>
         <w:rPr>
           <w:vertAlign w:val="superscript"/>
         </w:rPr>
-        <w:t xml:space="preserve">[14]</w:t>
-      </w:r>
-      <w:r>
-        <w:t xml:space="preserve">，而一项番茄病害TinyML研究报告模型运行占用1.1 MB RAM</w:t>
-      </w:r>
-      <w:r>
-        <w:rPr>
-          <w:vertAlign w:val="superscript"/>
-        </w:rPr>
-        <w:t xml:space="preserve">[25]</w:t>
+        <w:t xml:space="preserve">[5]</w:t>
       </w:r>
       <w:r>
         <w:t xml:space="preserve">；若该数值属实，系统必然使用了外部PSRAM，而PSRAM的带宽和时延会直接影响推理速度，论文不说明存储配置，读者便无法复现其结论。</w:t>
@@ -3609,22 +3318,13 @@
         <w:jc w:val="both"/>
       </w:pPr>
       <w:r>
-        <w:t xml:space="preserve">在操作系统层面，MCU多采用FreeRTOS等实时操作系统。ESP-IDF中的FreeRTOS支持双核调度和任务优先级</w:t>
+        <w:t xml:space="preserve">在操作系统层面，MCU多采用FreeRTOS等实时操作系统。ESP-IDF中的FreeRTOS支持双核调度和任务优先级，可以把图像采集、推理和通信拆分为不同优先级的任务。但采用RTOS并不自动意味着满足硬实时：推理耗时存在波动，安全相关的执行控制最好与推理路径分离，由独立的高优先级任务或独立MCU负责，并配合看门狗和超时保护。算力更强的SoC与GPU平台多运行嵌入式Linux，便于使用复杂驱动和推理框架，但调度确定性较差。因此，“Linux负责感知、MCU负责控制”的异构组合颇为常见，例如水稻害虫诱捕原型由Jetson Xavier NX完成视觉推理，再经UART把结果发送给ESP32，由后者驱动诱虫灯和风机</w:t>
       </w:r>
       <w:r>
         <w:rPr>
           <w:vertAlign w:val="superscript"/>
         </w:rPr>
-        <w:t xml:space="preserve">[40]</w:t>
-      </w:r>
-      <w:r>
-        <w:t xml:space="preserve">，可以把图像采集、推理和通信拆分为不同优先级的任务。但采用RTOS并不自动意味着满足硬实时：推理耗时存在波动，安全相关的执行控制最好与推理路径分离，由独立的高优先级任务或独立MCU负责，并配合看门狗和超时保护。算力更强的SoC与GPU平台多运行嵌入式Linux，便于使用复杂驱动和推理框架，但调度确定性较差。因此，“Linux负责感知、MCU负责控制”的异构组合颇为常见，例如水稻害虫诱捕原型由Jetson Xavier NX完成视觉推理，再经UART把结果发送给ESP32，由后者驱动诱虫灯和风机</w:t>
-      </w:r>
-      <w:r>
-        <w:rPr>
-          <w:vertAlign w:val="superscript"/>
-        </w:rPr>
-        <w:t xml:space="preserve">[33]</w:t>
+        <w:t xml:space="preserve">[11]</w:t>
       </w:r>
       <w:r>
         <w:t xml:space="preserve">。</w:t>
@@ -3637,43 +3337,16 @@
         <w:jc w:val="both"/>
       </w:pPr>
       <w:r>
-        <w:t xml:space="preserve">功耗管理是野外设备的另一核心问题，常见做法包括事件触发（如由光照或运动变化唤醒相机）、按作业需求切换功耗模式（Jetson Orin NX提供10—40 W多个功耗档</w:t>
+        <w:t xml:space="preserve">功耗管理是野外设备的另一核心问题，常见做法包括事件触发（如由光照或运动变化唤醒相机）、按作业需求切换功耗模式（Jetson Orin NX提供10—40 W多个功耗档）以及太阳能与电池管理</w:t>
       </w:r>
       <w:r>
         <w:rPr>
           <w:vertAlign w:val="superscript"/>
         </w:rPr>
-        <w:t xml:space="preserve">[20]</w:t>
-      </w:r>
-      <w:r>
-        <w:t xml:space="preserve">）以及太阳能与电池管理</w:t>
-      </w:r>
-      <w:r>
-        <w:rPr>
-          <w:vertAlign w:val="superscript"/>
-        </w:rPr>
-        <w:t xml:space="preserve">[33]</w:t>
-      </w:r>
-      <w:r>
-        <w:t xml:space="preserve">。模型更新方面，ESP-IDF提供基于双OTA分区的空中升级与回滚机制</w:t>
-      </w:r>
-      <w:r>
-        <w:rPr>
-          <w:vertAlign w:val="superscript"/>
-        </w:rPr>
-        <w:t xml:space="preserve">[39]</w:t>
-      </w:r>
-      <w:r>
-        <w:t xml:space="preserve">，但固件能够OTA并不等于模型可以安全更新：模型格式、算子集合与运行库版本需要做兼容检查，新模型应经过回归测试和签名验证，失败时能够自动回滚。NIST的物联网设备网络安全基线将设备标识、设备配置、数据保护、接口逻辑访问、软件更新和安全状态感知列为核心能力</w:t>
-      </w:r>
-      <w:r>
-        <w:rPr>
-          <w:vertAlign w:val="superscript"/>
-        </w:rPr>
-        <w:t xml:space="preserve">[41]</w:t>
-      </w:r>
-      <w:r>
-        <w:t xml:space="preserve">，可作为田间设备安全设计的检查清单。</w:t>
+        <w:t xml:space="preserve">[11]</w:t>
+      </w:r>
+      <w:r>
+        <w:t xml:space="preserve">。模型更新方面，ESP-IDF提供基于双OTA分区的空中升级与回滚机制，但固件能够OTA并不等于模型可以安全更新：模型格式、算子集合与运行库版本需要做兼容检查，新模型应经过回归测试和签名验证，失败时能够自动回滚。NIST的物联网设备网络安全基线将设备标识、设备配置、数据保护、接口逻辑访问、软件更新和安全状态感知列为核心能力，可作为田间设备安全设计的检查清单。</w:t>
       </w:r>
     </w:p>
     <w:p>
@@ -3791,7 +3464,7 @@
         <w:rPr>
           <w:vertAlign w:val="superscript"/>
         </w:rPr>
-        <w:t xml:space="preserve">[9,11]</w:t>
+        <w:t xml:space="preserve">[1,2]</w:t>
       </w:r>
       <w:r>
         <w:t xml:space="preserve">。Yu等将智慧农业的云边端协同归纳为分层体系，并以CloudCore/EdgeCore与EdgeX Foundry等组件说明了云原生的边缘管理方式</w:t>
@@ -3800,7 +3473,7 @@
         <w:rPr>
           <w:vertAlign w:val="superscript"/>
         </w:rPr>
-        <w:t xml:space="preserve">[11]</w:t>
+        <w:t xml:space="preserve">[2]</w:t>
       </w:r>
       <w:r>
         <w:t xml:space="preserve">；Gong等则从技术、应用和挑战三个层面分析了边缘计算赋能智慧农业的路径，认为其核心优势在于低时延响应、带宽优化和数据本地化</w:t>
@@ -3809,7 +3482,7 @@
         <w:rPr>
           <w:vertAlign w:val="superscript"/>
         </w:rPr>
-        <w:t xml:space="preserve">[9]</w:t>
+        <w:t xml:space="preserve">[1]</w:t>
       </w:r>
       <w:r>
         <w:t xml:space="preserve">。</w:t>
@@ -3918,7 +3591,7 @@
           <w:sz w:val="18"/>
           <w:szCs w:val="18"/>
         </w:rPr>
-        <w:t xml:space="preserve">[9,11,33,42]</w:t>
+        <w:t xml:space="preserve">[1,2,11,12]</w:t>
       </w:r>
       <w:r>
         <w:rPr>
@@ -4340,7 +4013,7 @@
                 <w:sz w:val="18"/>
                 <w:szCs w:val="18"/>
               </w:rPr>
-              <w:t xml:space="preserve">[26]</w:t>
+              <w:t xml:space="preserve">[6]</w:t>
             </w:r>
           </w:p>
         </w:tc>
@@ -4538,7 +4211,7 @@
                 <w:sz w:val="18"/>
                 <w:szCs w:val="18"/>
               </w:rPr>
-              <w:t xml:space="preserve">[25]</w:t>
+              <w:t xml:space="preserve">[5]</w:t>
             </w:r>
           </w:p>
         </w:tc>
@@ -4736,7 +4409,7 @@
                 <w:sz w:val="18"/>
                 <w:szCs w:val="18"/>
               </w:rPr>
-              <w:t xml:space="preserve">[33]</w:t>
+              <w:t xml:space="preserve">[11]</w:t>
             </w:r>
           </w:p>
         </w:tc>
@@ -4934,7 +4607,7 @@
                 <w:sz w:val="18"/>
                 <w:szCs w:val="18"/>
               </w:rPr>
-              <w:t xml:space="preserve">[27]</w:t>
+              <w:t xml:space="preserve">[7]</w:t>
             </w:r>
           </w:p>
         </w:tc>
@@ -5132,7 +4805,7 @@
                 <w:sz w:val="18"/>
                 <w:szCs w:val="18"/>
               </w:rPr>
-              <w:t xml:space="preserve">[24]</w:t>
+              <w:t xml:space="preserve">[4]</w:t>
             </w:r>
           </w:p>
         </w:tc>
@@ -5330,7 +5003,7 @@
                 <w:sz w:val="18"/>
                 <w:szCs w:val="18"/>
               </w:rPr>
-              <w:t xml:space="preserve">[43]</w:t>
+              <w:t xml:space="preserve">[13]</w:t>
             </w:r>
           </w:p>
         </w:tc>
@@ -5528,7 +5201,7 @@
                 <w:sz w:val="18"/>
                 <w:szCs w:val="18"/>
               </w:rPr>
-              <w:t xml:space="preserve">[44]</w:t>
+              <w:t xml:space="preserve">[14]</w:t>
             </w:r>
           </w:p>
         </w:tc>
@@ -5726,7 +5399,7 @@
                 <w:sz w:val="18"/>
                 <w:szCs w:val="18"/>
               </w:rPr>
-              <w:t xml:space="preserve">[45]</w:t>
+              <w:t xml:space="preserve">[15]</w:t>
             </w:r>
           </w:p>
         </w:tc>
@@ -5917,14 +5590,7 @@
                 <w:sz w:val="18"/>
                 <w:szCs w:val="18"/>
               </w:rPr>
-              <w:t xml:space="preserve">See &amp; Spray</w:t>
-            </w:r>
-            <w:r>
-              <w:rPr>
-                <w:sz w:val="18"/>
-                <w:szCs w:val="18"/>
-              </w:rPr>
-              <w:t xml:space="preserve">[7]</w:t>
+              <w:t xml:space="preserve">See &amp; Spray（John Deere）</w:t>
             </w:r>
           </w:p>
         </w:tc>
@@ -6115,14 +5781,7 @@
                 <w:sz w:val="18"/>
                 <w:szCs w:val="18"/>
               </w:rPr>
-              <w:t xml:space="preserve">LaserWeeder G2 600</w:t>
-            </w:r>
-            <w:r>
-              <w:rPr>
-                <w:sz w:val="18"/>
-                <w:szCs w:val="18"/>
-              </w:rPr>
-              <w:t xml:space="preserve">[46,47]</w:t>
+              <w:t xml:space="preserve">LaserWeeder G2 600（Carbon Robotics）</w:t>
             </w:r>
           </w:p>
         </w:tc>
@@ -6313,14 +5972,7 @@
                 <w:sz w:val="18"/>
                 <w:szCs w:val="18"/>
               </w:rPr>
-              <w:t xml:space="preserve">极飞P150</w:t>
-            </w:r>
-            <w:r>
-              <w:rPr>
-                <w:sz w:val="18"/>
-                <w:szCs w:val="18"/>
-              </w:rPr>
-              <w:t xml:space="preserve">[48]</w:t>
+              <w:t xml:space="preserve">极飞P150（XAG）</w:t>
             </w:r>
           </w:p>
         </w:tc>
@@ -6492,7 +6144,7 @@
           <w:sz w:val="18"/>
           <w:szCs w:val="18"/>
         </w:rPr>
-        <w:t xml:space="preserve">注：“作者报告”“厂商口径”均未经本文独立复现；各行指标的任务、数据集与测量条件不同，不能横向排名。</w:t>
+        <w:t xml:space="preserve">注：商业产品数据取自各厂商官网与新闻稿（2026年9月访问）。“作者报告”“厂商口径”均未经本文独立复现；各行指标的任务、数据集与测量条件不同，不能横向排名。</w:t>
       </w:r>
     </w:p>
     <w:p>
@@ -6516,7 +6168,7 @@
         <w:rPr>
           <w:vertAlign w:val="superscript"/>
         </w:rPr>
-        <w:t xml:space="preserve">[26]</w:t>
+        <w:t xml:space="preserve">[6]</w:t>
       </w:r>
       <w:r>
         <w:t xml:space="preserve">。Malche等进一步把番茄叶病识别下沉到ESP32-S3微控制器，通过MQTT经Wi-Fi上报结果，作者报告准确率为94.6%，并进行了7天的田间部署</w:t>
@@ -6525,7 +6177,7 @@
         <w:rPr>
           <w:vertAlign w:val="superscript"/>
         </w:rPr>
-        <w:t xml:space="preserve">[25]</w:t>
+        <w:t xml:space="preserve">[5]</w:t>
       </w:r>
       <w:r>
         <w:t xml:space="preserve">；但该文摘要同时给出“测试集平均推理500 ms”和“单张推理小于15 ms”两种差异悬殊的说法，训练数据也来自PlantVillage实验室图像，其实时性与田间适用性仍需核实。</w:t>
@@ -6550,7 +6202,7 @@
         <w:rPr>
           <w:vertAlign w:val="superscript"/>
         </w:rPr>
-        <w:t xml:space="preserve">[33]</w:t>
+        <w:t xml:space="preserve">[11]</w:t>
       </w:r>
       <w:r>
         <w:t xml:space="preserve">。系统由摄像头、Jetson Xavier NX、ESP32、8波段LED诱虫灯、杀虫风机、LoRa与GPS模块以及太阳能供电单元组成；改进后的YOLOv13检测模型经TensorRT FP16加速，作者报告mAP@0.5为96.1%，在Xavier NX上达到44.5 FPS，从图像采集到执行器动作的端到端时延平均为36.8 ms；在60分钟的双节点实验室测试中，约150次目标呈现有142次成功触发（94.7%），LoRa链路在500 m视距下的丢包率低于1.2%</w:t>
@@ -6559,7 +6211,7 @@
         <w:rPr>
           <w:vertAlign w:val="superscript"/>
         </w:rPr>
-        <w:t xml:space="preserve">[33]</w:t>
+        <w:t xml:space="preserve">[11]</w:t>
       </w:r>
       <w:r>
         <w:t xml:space="preserve">。该研究的价值在于打通了“感知—通信—执行”的完整链路，但其证据层级需要区分：推理性能来自设备测试，闭环成功率来自实验室，室外仅做了初步观察，多节点布设的覆盖收益来自仿真，均不能等同于田间灭虫率或减药效果。</w:t>
@@ -6658,7 +6310,7 @@
           <w:sz w:val="18"/>
           <w:szCs w:val="18"/>
         </w:rPr>
-        <w:t xml:space="preserve">[33]</w:t>
+        <w:t xml:space="preserve">[11]</w:t>
       </w:r>
       <w:r>
         <w:rPr>
@@ -6684,34 +6336,7 @@
         <w:jc w:val="both"/>
       </w:pPr>
       <w:r>
-        <w:t xml:space="preserve">杂草管理是端边智能商业化最成熟的领域，其共同特点是“机载视觉识别直接驱动执行器”。约翰迪尔的See &amp; Spray于2021年推出，借助喷杆摄像头和机载处理器逐株识别杂草，只在检测到杂草时开启对应的ExactApply喷嘴。厂商公布，2024年该技术在美国的应用面积超过100万英亩，与全面喷施相比平均节省除草剂59%，估计节省药液约800万加仑；厂商同时援引爱荷华州立大学的研究，称试验田平均节省药剂76%、每英亩节约15.7美元</w:t>
-      </w:r>
-      <w:r>
-        <w:rPr>
-          <w:vertAlign w:val="superscript"/>
-        </w:rPr>
-        <w:t xml:space="preserve">[7]</w:t>
-      </w:r>
-      <w:r>
-        <w:t xml:space="preserve">。Carbon Robotics的LaserWeeder G2 600则以激光替代化学除草，官网标称配置12个模块、24台240 W激光器和36个相机，作业效率为0.61—1.21 ha/h，并宣称除草效果最高可达99%</w:t>
-      </w:r>
-      <w:r>
-        <w:rPr>
-          <w:vertAlign w:val="superscript"/>
-        </w:rPr>
-        <w:t xml:space="preserve">[46]</w:t>
-      </w:r>
-      <w:r>
-        <w:t xml:space="preserve">；据厂商委托发布的材料，该系列机载使用多块NVIDIA GPU进行实时识别</w:t>
-      </w:r>
-      <w:r>
-        <w:rPr>
-          <w:vertAlign w:val="superscript"/>
-        </w:rPr>
-        <w:t xml:space="preserve">[47]</w:t>
-      </w:r>
-      <w:r>
-        <w:t xml:space="preserve">。上述数据均为厂商口径，缺少独立的长期对照试验，但足以说明：在移动作业中，“识别—瞄准—执行”必须在车载端完成。</w:t>
+        <w:t xml:space="preserve">杂草管理是端边智能商业化最成熟的领域，其共同特点是“机载视觉识别直接驱动执行器”。约翰迪尔的See &amp; Spray于2021年推出，借助喷杆摄像头和机载处理器逐株识别杂草，只在检测到杂草时开启对应的ExactApply喷嘴。据厂商2024年9月发布的新闻稿，该技术当年在美国的应用面积超过100万英亩，与全面喷施相比平均节省除草剂59%，估计节省药液约800万加仑；厂商同时援引爱荷华州立大学的研究，称试验田平均节省药剂76%、每英亩节约15.7美元。Carbon Robotics的LaserWeeder G2 600则以激光替代化学除草，官网标称配置12个模块、24台240 W激光器和36个相机，作业效率为0.61—1.21 ha/h，并宣称除草效果最高可达99%；据厂商委托发布的材料，该系列机载使用多块NVIDIA GPU进行实时识别。上述数据均为厂商口径，缺少独立的长期对照试验，但足以说明：在移动作业中，“识别—瞄准—执行”必须在车载端完成。</w:t>
       </w:r>
     </w:p>
     <w:p>
@@ -6727,7 +6352,7 @@
         <w:rPr>
           <w:vertAlign w:val="superscript"/>
         </w:rPr>
-        <w:t xml:space="preserve">[24]</w:t>
+        <w:t xml:space="preserve">[4]</w:t>
       </w:r>
       <w:r>
         <w:t xml:space="preserve">。该研究完整公开了工具链和功耗测量方法，但也暴露出两类问题：一是量化编译后精度明显下降，例如YOLOv8n的mAP@0.5由0.50降至0.29；二是其计时从“已处理的帧缓冲进入应用回调”开始，报告的“小于5 ms”难以代表完整的推理时延（详见4.1节）。</w:t>
@@ -6754,7 +6379,7 @@
         <w:rPr>
           <w:vertAlign w:val="superscript"/>
         </w:rPr>
-        <w:t xml:space="preserve">[43]</w:t>
+        <w:t xml:space="preserve">[13]</w:t>
       </w:r>
       <w:r>
         <w:t xml:space="preserve">。Liu等提出的GAE-YOLO面向番茄种植，用ZED双目相机、Jetson TX2和移动底盘构成感知机器人（</w:t>
@@ -6769,7 +6394,7 @@
         <w:rPr>
           <w:vertAlign w:val="superscript"/>
         </w:rPr>
-        <w:t xml:space="preserve">[44]</w:t>
+        <w:t xml:space="preserve">[14]</w:t>
       </w:r>
       <w:r>
         <w:t xml:space="preserve">。与静态分类相比，这类任务更接近农业机器人的连续作业需求；但检测、跟踪、测距乃至问答功能分别运行在哪一层、各占多少资源，原文并未完全公开，不宜把系统的整体成绩归于单一的端侧模型。</w:t>
@@ -6868,7 +6493,7 @@
           <w:sz w:val="18"/>
           <w:szCs w:val="18"/>
         </w:rPr>
-        <w:t xml:space="preserve">[44]</w:t>
+        <w:t xml:space="preserve">[14]</w:t>
       </w:r>
       <w:r>
         <w:rPr>
@@ -6900,7 +6525,7 @@
         <w:rPr>
           <w:vertAlign w:val="superscript"/>
         </w:rPr>
-        <w:t xml:space="preserve">[45]</w:t>
+        <w:t xml:space="preserve">[15]</w:t>
       </w:r>
       <w:r>
         <w:t xml:space="preserve">。作者报告在广西一个50公顷的大豆农场开展了为期半年（2023年5—10月）的部署，灌溉用水减少22%、施药次数减少18%</w:t>
@@ -6909,7 +6534,7 @@
         <w:rPr>
           <w:vertAlign w:val="superscript"/>
         </w:rPr>
-        <w:t xml:space="preserve">[45]</w:t>
+        <w:t xml:space="preserve">[15]</w:t>
       </w:r>
       <w:r>
         <w:t xml:space="preserve">。该研究的端、边、云方案对比将在4.4节讨论；这里需要指出，其“边缘”是高性能服务器而非低功耗网关，农业效益数据也来自作者自报，尚待独立验证。</w:t>
@@ -6930,61 +6555,7 @@
         <w:jc w:val="both"/>
       </w:pPr>
       <w:r>
-        <w:t xml:space="preserve">植保无人机是端侧智能的另一重要载体。我国植保无人驾驶航空器拥有量已达20.1万架</w:t>
-      </w:r>
-      <w:r>
-        <w:rPr>
-          <w:vertAlign w:val="superscript"/>
-        </w:rPr>
-        <w:t xml:space="preserve">[1]</w:t>
-      </w:r>
-      <w:r>
-        <w:t xml:space="preserve">，大疆农业估计截至2024年末其农业无人机在全球的在用量约为40万架</w:t>
-      </w:r>
-      <w:r>
-        <w:rPr>
-          <w:vertAlign w:val="superscript"/>
-        </w:rPr>
-        <w:t xml:space="preserve">[49]</w:t>
-      </w:r>
-      <w:r>
-        <w:t xml:space="preserve">。以极飞P150为例，其官网介绍该机配备4D成像雷达与摄像头，用于实时三维环境感知与智能飞行，最大载重70 kg、最大喷洒流量30 L/min，雷达探测范围为1.5—100 m</w:t>
-      </w:r>
-      <w:r>
-        <w:rPr>
-          <w:vertAlign w:val="superscript"/>
-        </w:rPr>
-        <w:t xml:space="preserve">[48]</w:t>
-      </w:r>
-      <w:r>
-        <w:t xml:space="preserve">。与学术原型不同，此类商业产品一般不公开主控芯片型号、NPU算力和模型结构，因而难以对其端侧AI进行定量比较。对于拖拉机和自走式农机，AI感知还必须融入既有的电子电气体系：ISO 11783（ISOBUS）规定了拖拉机与机具之间的串行控制与通信网络</w:t>
-      </w:r>
-      <w:r>
-        <w:rPr>
-          <w:vertAlign w:val="superscript"/>
-        </w:rPr>
-        <w:t xml:space="preserve">[50]</w:t>
-      </w:r>
-      <w:r>
-        <w:t xml:space="preserve">，ISO 25119规定了控制系统安全相关部件的设计与开发原则</w:t>
-      </w:r>
-      <w:r>
-        <w:rPr>
-          <w:vertAlign w:val="superscript"/>
-        </w:rPr>
-        <w:t xml:space="preserve">[51]</w:t>
-      </w:r>
-      <w:r>
-        <w:t xml:space="preserve">，ISO 18497-1:2024则针对部分自动化、半自主和自主农机的设计安全</w:t>
-      </w:r>
-      <w:r>
-        <w:rPr>
-          <w:vertAlign w:val="superscript"/>
-        </w:rPr>
-        <w:t xml:space="preserve">[52]</w:t>
-      </w:r>
-      <w:r>
-        <w:t xml:space="preserve">。换言之，检测精度再高，也不能替代机器安全设计。</w:t>
+        <w:t xml:space="preserve">植保无人机是端侧智能的另一重要载体。我国植保无人驾驶航空器拥有量已达20.1万架，大疆农业估计截至2024年末其农业无人机在全球的在用量约为40万架。以极飞P150为例，其官网介绍该机配备4D成像雷达与摄像头，用于实时三维环境感知与智能飞行，最大载重70 kg、最大喷洒流量30 L/min，雷达探测范围为1.5—100 m。与学术原型不同，此类商业产品一般不公开主控芯片型号、NPU算力和模型结构，因而难以对其端侧AI进行定量比较。对于拖拉机和自走式农机，AI感知还必须融入既有的电子电气体系：ISO 11783（ISOBUS）规定了拖拉机与机具之间的串行控制与通信网络，ISO 25119规定了控制系统安全相关部件的设计与开发原则，ISO 18497-1:2024则针对部分自动化、半自主和自主农机的设计安全。换言之，检测精度再高，也不能替代机器安全设计。</w:t>
       </w:r>
     </w:p>
     <w:p>
@@ -7022,7 +6593,7 @@
         <w:rPr>
           <w:vertAlign w:val="superscript"/>
         </w:rPr>
-        <w:t xml:space="preserve">[33]</w:t>
+        <w:t xml:space="preserve">[11]</w:t>
       </w:r>
       <w:r>
         <w:t xml:space="preserve">。据此推算，采集与推理等环节约占22 ms，与44.5 FPS对应的单帧周期（约22.5 ms）基本吻合。</w:t>
@@ -7041,16 +6612,7 @@
         <w:t xml:space="preserve">图11</w:t>
       </w:r>
       <w:r>
-        <w:t xml:space="preserve">b）。按“距离＝车速×时延”粗略换算，若喷雾机以约24 km/h（约15 mph）行进，每100 ms时延对应约0.67 m的位移；若采用约1 s的云端往返，位移可达6.5 m以上，远超单株作物的尺度。这从量级上说明了See &amp; Spray等系统必须在机载端完成判别与控制的原因</w:t>
-      </w:r>
-      <w:r>
-        <w:rPr>
-          <w:vertAlign w:val="superscript"/>
-        </w:rPr>
-        <w:t xml:space="preserve">[7]</w:t>
-      </w:r>
-      <w:r>
-        <w:t xml:space="preserve">。</w:t>
+        <w:t xml:space="preserve">b）。按“距离＝车速×时延”粗略换算，若喷雾机以约24 km/h（约15 mph）行进，每100 ms时延对应约0.67 m的位移；若采用约1 s的云端往返，位移可达6.5 m以上，远超单株作物的尺度。这从量级上说明了See &amp; Spray等系统必须在机载端完成判别与控制的原因。</w:t>
       </w:r>
     </w:p>
     <w:p>
@@ -7066,7 +6628,7 @@
         <w:rPr>
           <w:vertAlign w:val="superscript"/>
         </w:rPr>
-        <w:t xml:space="preserve">[27]</w:t>
+        <w:t xml:space="preserve">[7]</w:t>
       </w:r>
       <w:r>
         <w:t xml:space="preserve">。一种可能的解释是帧率统计包含了视频采集与前后处理，而延迟仅为推理时间，但原文未予说明。前述TinyML番茄研究同时报告500 ms和小于15 ms两种推理时间</w:t>
@@ -7075,7 +6637,7 @@
         <w:rPr>
           <w:vertAlign w:val="superscript"/>
         </w:rPr>
-        <w:t xml:space="preserve">[25]</w:t>
+        <w:t xml:space="preserve">[5]</w:t>
       </w:r>
       <w:r>
         <w:t xml:space="preserve">。Hailo杂草研究的计时起点位于推理完成之后，结果中参数量最大的YOLOv11x（HEF文件58.8 MB）报告延迟仅2.0 ms，反而快于YOLOv11n的4.2 ms，并由此得出最高5268倍的“加速比”（</w:t>
@@ -7090,7 +6652,7 @@
         <w:rPr>
           <w:vertAlign w:val="superscript"/>
         </w:rPr>
-        <w:t xml:space="preserve">[24]</w:t>
+        <w:t xml:space="preserve">[4]</w:t>
       </w:r>
       <w:r>
         <w:t xml:space="preserve">；这种与模型规模相反的规律提示，所测时间主要是后处理和结果解析，而非完整推理。以上分析并非否定这些研究的工程价值，而是说明引用时延数据时必须同时交代计时的起止点。</w:t>
@@ -7189,7 +6751,7 @@
           <w:sz w:val="18"/>
           <w:szCs w:val="18"/>
         </w:rPr>
-        <w:t xml:space="preserve">[33]</w:t>
+        <w:t xml:space="preserve">[11]</w:t>
       </w:r>
       <w:r>
         <w:rPr>
@@ -7205,7 +6767,7 @@
           <w:sz w:val="18"/>
           <w:szCs w:val="18"/>
         </w:rPr>
-        <w:t xml:space="preserve">[33,45]</w:t>
+        <w:t xml:space="preserve">[11,15]</w:t>
       </w:r>
       <w:r>
         <w:rPr>
@@ -7309,7 +6871,7 @@
           <w:sz w:val="18"/>
           <w:szCs w:val="18"/>
         </w:rPr>
-        <w:t xml:space="preserve">[24]</w:t>
+        <w:t xml:space="preserve">[4]</w:t>
       </w:r>
       <w:r>
         <w:rPr>
@@ -7335,22 +6897,13 @@
         <w:jc w:val="both"/>
       </w:pPr>
       <w:r>
-        <w:t xml:space="preserve">田间常用的低功耗广域网带宽极为有限。以欧洲868 MHz频段的LoRaWAN为例，最快的DR5档（SF7/125 kHz）物理层速率约为5470 bit/s，单帧应用载荷最大222字节，低速档仅51字节，默认信道还受1%占空比的限制</w:t>
+        <w:t xml:space="preserve">田间常用的低功耗广域网带宽极为有限。根据LoRaWAN区域参数规范，以欧洲868 MHz频段为例，最快的DR5档（SF7/125 kHz）物理层速率约为5470 bit/s，单帧应用载荷最大222字节，低速档仅51字节，默认信道还受1%占空比的限制。这决定了LoRa只能传输“结论”——告警、计数、坐标、置信度或少量特征，而不能传输图像；水稻害虫诱捕原型正是用LoRa传输定位与协同信息</w:t>
       </w:r>
       <w:r>
         <w:rPr>
           <w:vertAlign w:val="superscript"/>
         </w:rPr>
-        <w:t xml:space="preserve">[8]</w:t>
-      </w:r>
-      <w:r>
-        <w:t xml:space="preserve">。这决定了LoRa只能传输“结论”——告警、计数、坐标、置信度或少量特征，而不能传输图像；水稻害虫诱捕原型正是用LoRa传输定位与协同信息</w:t>
-      </w:r>
-      <w:r>
-        <w:rPr>
-          <w:vertAlign w:val="superscript"/>
-        </w:rPr>
-        <w:t xml:space="preserve">[33]</w:t>
+        <w:t xml:space="preserve">[11]</w:t>
       </w:r>
       <w:r>
         <w:t xml:space="preserve">。作为对照，若一路相机每秒上传一帧约200 KB的压缩图像（示意性假设），一天即产生约17 GB数据，即便采用4G/5G，也会带来可观的流量费用和发送能耗。</w:t>
@@ -7369,7 +6922,7 @@
         <w:rPr>
           <w:vertAlign w:val="superscript"/>
         </w:rPr>
-        <w:t xml:space="preserve">[45]</w:t>
+        <w:t xml:space="preserve">[15]</w:t>
       </w:r>
       <w:r>
         <w:t xml:space="preserve">。按上述参数粗算，2.3 KB至少需要拆分为11帧，仅比特传输时间就约为3.4 s，还要服从占空比限制，显然无法在210 ms内完成。可能的解释是LoRaWAN传输并不在每次预测的关键路径上，或时延统计未计入通信，但原文未予说明。这个例子提示，端边协同研究应当公布逐跳计时与通信日志，否则“协同优于云端”的结论难以复现。</w:t>
@@ -7402,7 +6955,7 @@
         <w:rPr>
           <w:vertAlign w:val="superscript"/>
         </w:rPr>
-        <w:t xml:space="preserve">[27]</w:t>
+        <w:t xml:space="preserve">[7]</w:t>
       </w:r>
       <w:r>
         <w:t xml:space="preserve">。若按“功耗×延迟”粗略估算单帧能耗，则由约169 mJ降至约40 mJ（本文推算，因功耗采样边界未明，仅供参考）。然而，量化并非总是“几乎无损”。在Hailo杂草研究中，10个模型转换为HEF后，mAP@0.5下降了0.05—0.21，其中YOLOv8n由0.50降至0.29（</w:t>
@@ -7417,7 +6970,7 @@
         <w:rPr>
           <w:vertAlign w:val="superscript"/>
         </w:rPr>
-        <w:t xml:space="preserve">[24]</w:t>
+        <w:t xml:space="preserve">[4]</w:t>
       </w:r>
       <w:r>
         <w:t xml:space="preserve">。作者发现，精度下降与目标平均尺寸存在中等程度的相关趋势（r=0.49，p=0.086，未达显著水平），而与类别样本数基本无关（r=0.08），并认为低精度数值对细粒度空间特征和边界定位的影响更大</w:t>
@@ -7426,7 +6979,7 @@
         <w:rPr>
           <w:vertAlign w:val="superscript"/>
         </w:rPr>
-        <w:t xml:space="preserve">[24]</w:t>
+        <w:t xml:space="preserve">[4]</w:t>
       </w:r>
       <w:r>
         <w:t xml:space="preserve">。这提示小目标密集、类别不均衡的农业数据对低比特量化更为敏感，量化方案应使用任务数据校准，并在目标硬件上逐类评估精度，而不能只看总体指标。</w:t>
@@ -7439,34 +6992,16 @@
         <w:jc w:val="both"/>
       </w:pPr>
       <w:r>
-        <w:t xml:space="preserve">能耗比较还必须统一功耗边界。Hailo-8L芯片的典型功耗为1.5 W</w:t>
+        <w:t xml:space="preserve">能耗比较还必须统一功耗边界。Hailo-8L芯片的典型功耗为1.5 W，而整套系统输入功耗为5.4—7.2 W</w:t>
       </w:r>
       <w:r>
         <w:rPr>
           <w:vertAlign w:val="superscript"/>
         </w:rPr>
-        <w:t xml:space="preserve">[23]</w:t>
-      </w:r>
-      <w:r>
-        <w:t xml:space="preserve">，而整套系统输入功耗为5.4—7.2 W</w:t>
-      </w:r>
-      <w:r>
-        <w:rPr>
-          <w:vertAlign w:val="superscript"/>
-        </w:rPr>
-        <w:t xml:space="preserve">[24]</w:t>
-      </w:r>
-      <w:r>
-        <w:t xml:space="preserve">，两者相差数倍；LaserWeeder的24台240 W激光器合计额定功率达5.76 kW（本文按官网参数相乘）</w:t>
-      </w:r>
-      <w:r>
-        <w:rPr>
-          <w:vertAlign w:val="superscript"/>
-        </w:rPr>
-        <w:t xml:space="preserve">[46]</w:t>
-      </w:r>
-      <w:r>
-        <w:t xml:space="preserve">，这是执行器功率而非AI计算功耗。在野外节点中，相机、通信模块和执行器的能耗可能与推理相当甚至更大，因此“低功耗AI”应当以整机、全任务周期的能量预算来衡量。</w:t>
+        <w:t xml:space="preserve">[4]</w:t>
+      </w:r>
+      <w:r>
+        <w:t xml:space="preserve">，两者相差数倍；LaserWeeder的24台240 W激光器合计额定功率达5.76 kW（本文按官网参数相乘），这是执行器功率而非AI计算功耗。在野外节点中，相机、通信模块和执行器的能耗可能与推理相当甚至更大，因此“低功耗AI”应当以整机、全任务周期的能量预算来衡量。</w:t>
       </w:r>
     </w:p>
     <w:p>
@@ -7562,7 +7097,7 @@
           <w:sz w:val="18"/>
           <w:szCs w:val="18"/>
         </w:rPr>
-        <w:t xml:space="preserve">[27]</w:t>
+        <w:t xml:space="preserve">[7]</w:t>
       </w:r>
       <w:r>
         <w:rPr>
@@ -8839,7 +8374,7 @@
         <w:rPr>
           <w:vertAlign w:val="superscript"/>
         </w:rPr>
-        <w:t xml:space="preserve">[45]</w:t>
+        <w:t xml:space="preserve">[15]</w:t>
       </w:r>
       <w:r>
         <w:t xml:space="preserve">：在大豆数据上，阈值法的时延为50 ms、每次预测能耗0.8 J、F1值0.61；端侧LSTM分别为120 ms、3.2 J和0.72；云端PINN为980 ms、18.7 J和0.85；端边混合方案为210 ms、5.1 J和0.89±0.02。结果呈现出“精度—时延—能耗”的典型折中：混合方案以接近端侧的时延和能耗取得了最高的精度。但由于各方案的模型、硬件和网络同时改变，能耗是否计入服务器与通信也不清楚，这组数据只能说明作者构建的几种系统组合存在不同权衡，不能证明部署位置本身带来的因果收益，更不能推广为“端边协同一定优于云端”。</w:t>
@@ -8938,7 +8473,7 @@
           <w:sz w:val="18"/>
           <w:szCs w:val="18"/>
         </w:rPr>
-        <w:t xml:space="preserve">[45]</w:t>
+        <w:t xml:space="preserve">[15]</w:t>
       </w:r>
       <w:r>
         <w:rPr>
@@ -8964,25 +8499,7 @@
         <w:jc w:val="both"/>
       </w:pPr>
       <w:r>
-        <w:t xml:space="preserve">农业端边系统的可靠性不仅取决于模型精度，还取决于断网、断电、传感器污染和环境变化时的系统行为。设计上应当明确降级策略：网络中断时本地缓存数据并维持核心闭环；AI置信度低时不直接触发高风险动作，而是降级为告警或请求人工确认；执行器应设置互锁和超时保护。对于农机和自主作业装备，AI感知应纳入ISO 25119、ISO 18497等功能安全框架进行风险分析</w:t>
-      </w:r>
-      <w:r>
-        <w:rPr>
-          <w:vertAlign w:val="superscript"/>
-        </w:rPr>
-        <w:t xml:space="preserve">[51,52]</w:t>
-      </w:r>
-      <w:r>
-        <w:t xml:space="preserve">。网络安全方面，田间设备分布广、物理防护弱，需要设备身份认证、最小权限接口、固件与模型签名，以及可回滚的安全更新</w:t>
-      </w:r>
-      <w:r>
-        <w:rPr>
-          <w:vertAlign w:val="superscript"/>
-        </w:rPr>
-        <w:t xml:space="preserve">[39,41]</w:t>
-      </w:r>
-      <w:r>
-        <w:t xml:space="preserve">。</w:t>
+        <w:t xml:space="preserve">农业端边系统的可靠性不仅取决于模型精度，还取决于断网、断电、传感器污染和环境变化时的系统行为。设计上应当明确降级策略：网络中断时本地缓存数据并维持核心闭环；AI置信度低时不直接触发高风险动作，而是降级为告警或请求人工确认；执行器应设置互锁和超时保护。对于农机和自主作业装备，AI感知应纳入ISO 25119、ISO 18497等功能安全框架进行风险分析。网络安全方面，田间设备分布广、物理防护弱，需要设备身份认证、最小权限接口、固件与模型签名，以及可回滚的安全更新。</w:t>
       </w:r>
     </w:p>
     <w:p>
@@ -9014,7 +8531,7 @@
         <w:rPr>
           <w:vertAlign w:val="superscript"/>
         </w:rPr>
-        <w:t xml:space="preserve">[33]</w:t>
+        <w:t xml:space="preserve">[11]</w:t>
       </w:r>
       <w:r>
         <w:t xml:space="preserve">，Hailo杂草研究的独立测试集为94张图像</w:t>
@@ -9023,7 +8540,7 @@
         <w:rPr>
           <w:vertAlign w:val="superscript"/>
         </w:rPr>
-        <w:t xml:space="preserve">[24]</w:t>
+        <w:t xml:space="preserve">[4]</w:t>
       </w:r>
       <w:r>
         <w:t xml:space="preserve">，TinyML番茄研究使用的则是实验室背景的PlantVillage数据</w:t>
@@ -9032,7 +8549,7 @@
         <w:rPr>
           <w:vertAlign w:val="superscript"/>
         </w:rPr>
-        <w:t xml:space="preserve">[25]</w:t>
+        <w:t xml:space="preserve">[5]</w:t>
       </w:r>
       <w:r>
         <w:t xml:space="preserve">。类别不均衡也很普遍，Hailo杂草研究的数据集中作物目标占79.5%、杂草仅占20.5%（</w:t>
@@ -9047,7 +8564,7 @@
         <w:rPr>
           <w:vertAlign w:val="superscript"/>
         </w:rPr>
-        <w:t xml:space="preserve">[24]</w:t>
+        <w:t xml:space="preserve">[4]</w:t>
       </w:r>
       <w:r>
         <w:t xml:space="preserve">，而杂草恰恰是需要被识别的对象。数据增广可以扩大训练集，却不能替代跨地块、跨季节的独立采样；模型上线后还会遇到数据漂移，需要监测置信度分布并持续收集困难样本。</w:t>
@@ -9146,7 +8663,7 @@
           <w:sz w:val="18"/>
           <w:szCs w:val="18"/>
         </w:rPr>
-        <w:t xml:space="preserve">[24]</w:t>
+        <w:t xml:space="preserve">[4]</w:t>
       </w:r>
       <w:r>
         <w:rPr>
@@ -9178,7 +8695,7 @@
         <w:rPr>
           <w:vertAlign w:val="superscript"/>
         </w:rPr>
-        <w:t xml:space="preserve">[43]</w:t>
+        <w:t xml:space="preserve">[13]</w:t>
       </w:r>
       <w:r>
         <w:t xml:space="preserve">。这使得跨论文比较几乎无法进行。</w:t>
@@ -10057,7 +9574,7 @@
         <w:rPr>
           <w:vertAlign w:val="superscript"/>
         </w:rPr>
-        <w:t xml:space="preserve">[9]</w:t>
+        <w:t xml:space="preserve">[1]</w:t>
       </w:r>
       <w:r>
         <w:t xml:space="preserve">：地形遮挡和农机振动造成丢包，移动平台的振动影响结构和作业质量，太阳能供电不稳定而执行器功耗较高。实验室中成功率达94.7%的闭环系统</w:t>
@@ -10066,7 +9583,7 @@
         <w:rPr>
           <w:vertAlign w:val="superscript"/>
         </w:rPr>
-        <w:t xml:space="preserve">[33]</w:t>
+        <w:t xml:space="preserve">[11]</w:t>
       </w:r>
       <w:r>
         <w:t xml:space="preserve">，到了田间还要面对虫种变化、镜头污染和供电波动，其长期可靠性仍有待验证。</w:t>
@@ -10087,25 +9604,7 @@
         <w:jc w:val="both"/>
       </w:pPr>
       <w:r>
-        <w:t xml:space="preserve">目前几乎没有公开的、可比较的全生命周期成本数据。农业端边系统的成本不仅包括开发板，还包括相机、通信、供电、防护外壳、数据标注、安装维护和停机损失。商业产品的效益数据多为厂商口径，如See &amp; Spray平均节药59%、LaserWeeder最高99%的除草效果</w:t>
-      </w:r>
-      <w:r>
-        <w:rPr>
-          <w:vertAlign w:val="superscript"/>
-        </w:rPr>
-        <w:t xml:space="preserve">[7,46]</w:t>
-      </w:r>
-      <w:r>
-        <w:t xml:space="preserve">，而学术研究很少开展多年、多农场的经济评估。对于以小农户为主的中国农业，设备价格、服务模式（如按亩收费的社会化服务）和运维能力可能比算法精度更能决定推广速度，这也是政策文件强调“引导小农户融入现代农业发展轨道”的原因之一</w:t>
-      </w:r>
-      <w:r>
-        <w:rPr>
-          <w:vertAlign w:val="superscript"/>
-        </w:rPr>
-        <w:t xml:space="preserve">[5]</w:t>
-      </w:r>
-      <w:r>
-        <w:t xml:space="preserve">。</w:t>
+        <w:t xml:space="preserve">目前几乎没有公开的、可比较的全生命周期成本数据。农业端边系统的成本不仅包括开发板，还包括相机、通信、供电、防护外壳、数据标注、安装维护和停机损失。商业产品的效益数据多为厂商口径，如See &amp; Spray平均节药59%、LaserWeeder最高99%的除草效果，而学术研究很少开展多年、多农场的经济评估。对于以小农户为主的中国农业，设备价格、服务模式（如按亩收费的社会化服务）和运维能力可能比算法精度更能决定推广速度，这也是政策文件强调“引导小农户融入现代农业发展轨道”的原因之一。</w:t>
       </w:r>
     </w:p>
     <w:p>
@@ -10123,25 +9622,7 @@
         <w:jc w:val="both"/>
       </w:pPr>
       <w:r>
-        <w:t xml:space="preserve">农业装备生态的碎片化十分明显：不同厂商的NPU工具链和模型格式互不兼容；ISOBUS解决了拖拉机与机具之间的通信互通</w:t>
-      </w:r>
-      <w:r>
-        <w:rPr>
-          <w:vertAlign w:val="superscript"/>
-        </w:rPr>
-        <w:t xml:space="preserve">[50]</w:t>
-      </w:r>
-      <w:r>
-        <w:t xml:space="preserve">，却不涉及AI模型、数据语义和云端接口的互操作。现有机械安全标准尚未专门规定基于学习的感知系统应如何验证，NIST等网络安全基线也并非农业领域的强制标准</w:t>
-      </w:r>
-      <w:r>
-        <w:rPr>
-          <w:vertAlign w:val="superscript"/>
-        </w:rPr>
-        <w:t xml:space="preserve">[41]</w:t>
-      </w:r>
-      <w:r>
-        <w:t xml:space="preserve">。标准与测评体系的缺位，使厂商和研究者都难以证明其系统“足够安全、足够可靠”。</w:t>
+        <w:t xml:space="preserve">农业装备生态的碎片化十分明显：不同厂商的NPU工具链和模型格式互不兼容；ISOBUS解决了拖拉机与机具之间的通信互通，却不涉及AI模型、数据语义和云端接口的互操作。现有机械安全标准尚未专门规定基于学习的感知系统应如何验证，NIST等网络安全基线也并非农业领域的强制标准。标准与测评体系的缺位，使厂商和研究者都难以证明其系统“足够安全、足够可靠”。</w:t>
       </w:r>
     </w:p>
     <w:p>
@@ -10167,52 +9648,25 @@
         <w:jc w:val="both"/>
       </w:pPr>
       <w:r>
-        <w:t xml:space="preserve">大模型正在进入农业，但其部署位置应与任务相匹配。《全国智慧农业行动计划（2024—2028年）》明确提出，加快推动人工智能大模型在农业农村科研、生产经营、管理服务等重点领域的应用</w:t>
+        <w:t xml:space="preserve">大模型正在进入农业，但其部署位置应与任务相匹配。《全国智慧农业行动计划（2024—2028年）》明确提出，加快推动人工智能大模型在农业农村科研、生产经营、管理服务等重点领域的应用；赵春江的综述指出，农业知识智能服务需要把多源感知转化为可供生产决策使用的知识</w:t>
       </w:r>
       <w:r>
         <w:rPr>
           <w:vertAlign w:val="superscript"/>
         </w:rPr>
-        <w:t xml:space="preserve">[4]</w:t>
-      </w:r>
-      <w:r>
-        <w:t xml:space="preserve">；赵春江的综述指出，农业知识智能服务需要把多源感知转化为可供生产决策使用的知识</w:t>
+        <w:t xml:space="preserve">[3]</w:t>
+      </w:r>
+      <w:r>
+        <w:t xml:space="preserve">。在硬件方面，NVIDIA将Orin Nano Super定位为面向生成式AI的嵌入式平台。Jiang等提出的Farm-LightSeek框架在边缘节点部署轻量化大语言模型，融合图像、气象和地理信息进行跨模态推理与病害检测，由云端负责模型更新，构成“感知—决策—执行”闭环</w:t>
       </w:r>
       <w:r>
         <w:rPr>
           <w:vertAlign w:val="superscript"/>
         </w:rPr>
-        <w:t xml:space="preserve">[12]</w:t>
-      </w:r>
-      <w:r>
-        <w:t xml:space="preserve">。在硬件方面，NVIDIA将Orin Nano Super定位为面向生成式AI的嵌入式平台</w:t>
-      </w:r>
-      <w:r>
-        <w:rPr>
-          <w:vertAlign w:val="superscript"/>
-        </w:rPr>
-        <w:t xml:space="preserve">[22]</w:t>
-      </w:r>
-      <w:r>
-        <w:t xml:space="preserve">。Jiang等提出的Farm-LightSeek框架在边缘节点部署轻量化大语言模型，融合图像、气象和地理信息进行跨模态推理与病害检测，由云端负责模型更新，构成“感知—决策—执行”闭环</w:t>
-      </w:r>
-      <w:r>
-        <w:rPr>
-          <w:vertAlign w:val="superscript"/>
-        </w:rPr>
-        <w:t xml:space="preserve">[53]</w:t>
-      </w:r>
-      <w:r>
-        <w:t xml:space="preserve">。较为可行的形态是：端侧小模型负责高频感知与实时控制，边缘或云端的大模型负责诊断解释、农事问答和跨模态推理，两者通过知识蒸馏</w:t>
-      </w:r>
-      <w:r>
-        <w:rPr>
-          <w:vertAlign w:val="superscript"/>
-        </w:rPr>
-        <w:t xml:space="preserve">[30]</w:t>
-      </w:r>
-      <w:r>
-        <w:t xml:space="preserve">与模型下发相互衔接；MCU级设备在可预见的将来并不适合直接运行大模型。</w:t>
+        <w:t xml:space="preserve">[16]</w:t>
+      </w:r>
+      <w:r>
+        <w:t xml:space="preserve">。较为可行的形态是：端侧小模型负责高频感知与实时控制，边缘或云端的大模型负责诊断解释、农事问答和跨模态推理，两者通过知识蒸馏与模型下发相互衔接；MCU级设备在可预见的将来并不适合直接运行大模型。</w:t>
       </w:r>
     </w:p>
     <w:p>
@@ -10230,22 +9684,13 @@
         <w:jc w:val="both"/>
       </w:pPr>
       <w:r>
-        <w:t xml:space="preserve">单一的可见光图像难以应对遮挡、夜间和雨雾等情况。农机和无人机正在融合双目视觉、毫米波或4D成像雷达、多光谱及环境传感器，例如极飞P150结合4D成像雷达与视觉进行环境感知</w:t>
+        <w:t xml:space="preserve">单一的可见光图像难以应对遮挡、夜间和雨雾等情况。农机和无人机正在融合双目视觉、毫米波或4D成像雷达、多光谱及环境传感器，例如极飞P150结合4D成像雷达与视觉进行环境感知，番茄机器人利用双目相机获取空间信息</w:t>
       </w:r>
       <w:r>
         <w:rPr>
           <w:vertAlign w:val="superscript"/>
         </w:rPr>
-        <w:t xml:space="preserve">[48]</w:t>
-      </w:r>
-      <w:r>
-        <w:t xml:space="preserve">，番茄机器人利用双目相机获取空间信息</w:t>
-      </w:r>
-      <w:r>
-        <w:rPr>
-          <w:vertAlign w:val="superscript"/>
-        </w:rPr>
-        <w:t xml:space="preserve">[44]</w:t>
+        <w:t xml:space="preserve">[14]</w:t>
       </w:r>
       <w:r>
         <w:t xml:space="preserve">。多模态融合对端侧算力、时间同步和带宽提出了更高要求，将推动异构计算平台在农机上的普及。</w:t>
@@ -10272,7 +9717,7 @@
         <w:rPr>
           <w:vertAlign w:val="superscript"/>
         </w:rPr>
-        <w:t xml:space="preserve">[42]</w:t>
+        <w:t xml:space="preserve">[12]</w:t>
       </w:r>
       <w:r>
         <w:t xml:space="preserve">。通信开销、非独立同分布数据和设备异构仍是主要障碍。与之相关，面向季节漂移的持续学习与端侧增量训练也是重要方向，但目前在农业中尚缺乏规模化验证。</w:t>
@@ -10293,31 +9738,13 @@
         <w:jc w:val="both"/>
       </w:pPr>
       <w:r>
-        <w:t xml:space="preserve">MCU内置NPU（如STM32N6的600 GOPS Neural-ART加速器</w:t>
+        <w:t xml:space="preserve">MCU内置NPU（如STM32N6的600 GOPS Neural-ART加速器）、SoC集成微NPU以及低功耗专用加速卡，正在把神经网络推理能力扩展到更低成本、更低功耗的设备上。我国政策也把农业传感器与专用芯片列为关键核心技术攻关方向。另一方面，MCUNet的经验表明，只有把网络结构、推理引擎和硬件约束联合优化，才能在极小的资源下获得实用精度</w:t>
       </w:r>
       <w:r>
         <w:rPr>
           <w:vertAlign w:val="superscript"/>
         </w:rPr>
-        <w:t xml:space="preserve">[16]</w:t>
-      </w:r>
-      <w:r>
-        <w:t xml:space="preserve">）、SoC集成微NPU以及低功耗专用加速卡，正在把神经网络推理能力扩展到更低成本、更低功耗的设备上。我国政策也把农业传感器与专用芯片列为关键核心技术攻关方向</w:t>
-      </w:r>
-      <w:r>
-        <w:rPr>
-          <w:vertAlign w:val="superscript"/>
-        </w:rPr>
-        <w:t xml:space="preserve">[5]</w:t>
-      </w:r>
-      <w:r>
-        <w:t xml:space="preserve">。另一方面，MCUNet的经验表明，只有把网络结构、推理引擎和硬件约束联合优化，才能在极小的资源下获得实用精度</w:t>
-      </w:r>
-      <w:r>
-        <w:rPr>
-          <w:vertAlign w:val="superscript"/>
-        </w:rPr>
-        <w:t xml:space="preserve">[32]</w:t>
+        <w:t xml:space="preserve">[10]</w:t>
       </w:r>
       <w:r>
         <w:t xml:space="preserve">。面向农业的软硬件协同设计——例如针对小目标和类别不均衡的量化方法、面向太阳能供电的能量感知调度——有望成为研究热点。</w:t>
@@ -10338,25 +9765,7 @@
         <w:jc w:val="both"/>
       </w:pPr>
       <w:r>
-        <w:t xml:space="preserve">未来需要建立面向农业端边智能的统一测评基准，统一数据划分（跨地块、跨季节）、时延定义（端到端与P99）和功耗边界，并纳入长期田间对照和经济性评价。ISO于2024年发布了面向自主农机设计安全的ISO 18497-1:2024</w:t>
-      </w:r>
-      <w:r>
-        <w:rPr>
-          <w:vertAlign w:val="superscript"/>
-        </w:rPr>
-        <w:t xml:space="preserve">[52]</w:t>
-      </w:r>
-      <w:r>
-        <w:t xml:space="preserve">，我国的行动计划和指导意见则从政策层面为智慧农业设定了2026—2035年的阶段目标</w:t>
-      </w:r>
-      <w:r>
-        <w:rPr>
-          <w:vertAlign w:val="superscript"/>
-        </w:rPr>
-        <w:t xml:space="preserve">[4,5]</w:t>
-      </w:r>
-      <w:r>
-        <w:t xml:space="preserve">。相关方法、硬件、应用与政策的演进脉络见</w:t>
+        <w:t xml:space="preserve">未来需要建立面向农业端边智能的统一测评基准，统一数据划分（跨地块、跨季节）、时延定义（端到端与P99）和功耗边界，并纳入长期田间对照和经济性评价。ISO于2024年发布了面向自主农机设计安全的ISO 18497-1:2024，我国的行动计划和指导意见则从政策层面为智慧农业设定了2026—2035年的阶段目标。相关方法、硬件、应用与政策的演进脉络见</w:t>
       </w:r>
       <w:r>
         <w:t xml:space="preserve">图16</w:t>
@@ -10547,7 +9956,7 @@
           <w:sz w:val="20"/>
           <w:szCs w:val="20"/>
         </w:rPr>
-        <w:t xml:space="preserve">农业农村部农业机械化管理司. 2024年全国农业机械化发展统计公报[EB/OL]. (2025-11-20)[2026-09-30]. https://njhs.moa.gov.cn/nyjxhqk/202511/t20251120_6479055.htm.</w:t>
+        <w:t xml:space="preserve">GONG R, ZHANG H, LI G, et al. Edge computing-enabled smart agriculture: technical architectures, practical evolution, and bottleneck breakthroughs[J]. Sensors, 2025, 25(17): 5302. DOI:10.3390/s25175302.</w:t>
       </w:r>
     </w:p>
     <w:p>
@@ -10568,7 +9977,7 @@
           <w:sz w:val="20"/>
           <w:szCs w:val="20"/>
         </w:rPr>
-        <w:t xml:space="preserve">国家统计局. 国家统计局关于2025年粮食产量数据的公告[EB/OL]. (2025-12-12)[2026-09-30]. https://www.stats.gov.cn/sj/zxfb/202512/t20251212_1962049.html.</w:t>
+        <w:t xml:space="preserve">YU P, TENG F, ZHU W, et al. Cloud–edge–device collaborative computing in smart agriculture: architectures, applications, and future perspectives[J]. Frontiers in Plant Science, 2025, 16: 1668545. DOI:10.3389/fpls.2025.1668545.</w:t>
       </w:r>
     </w:p>
     <w:p>
@@ -10589,7 +9998,7 @@
           <w:sz w:val="20"/>
           <w:szCs w:val="20"/>
         </w:rPr>
-        <w:t xml:space="preserve">中央网信办. 尺素金声｜中国农村互联网普及率再提升2个百分点，会带来什么[EB/OL]. (2024-06-20)[2026-09-30]. https://www.cac.gov.cn/2024-06/20/c_1720562096346307.htm.</w:t>
+        <w:t xml:space="preserve">赵春江. 农业知识智能服务技术综述[J]. 智慧农业(中英文), 2023, 5(2): 126-148. DOI:10.12133/j.smartag.SA202306002.</w:t>
       </w:r>
     </w:p>
     <w:p>
@@ -10610,7 +10019,7 @@
           <w:sz w:val="20"/>
           <w:szCs w:val="20"/>
         </w:rPr>
-        <w:t xml:space="preserve">农业农村部. 全国智慧农业行动计划（2024—2028年）[EB/OL]. (2024-11-22)[2026-09-30]. https://www.moa.gov.cn/nybgb/2024/202411/202411/t20241122_6466716.htm.</w:t>
+        <w:t xml:space="preserve">SALEM M A, RABIA A H. Enabling scalable and energy-efficient weed detection using data-driven edge AI for precision agriculture[J]. Frontiers in Agronomy, 2026, 8: 1808404. DOI:10.3389/fagro.2026.1808404.</w:t>
       </w:r>
     </w:p>
     <w:p>
@@ -10631,7 +10040,7 @@
           <w:sz w:val="20"/>
           <w:szCs w:val="20"/>
         </w:rPr>
-        <w:t xml:space="preserve">农业农村部. 农业农村部关于大力发展智慧农业的指导意见：农市发〔2024〕3号[EB/OL]. (2024-10-24)[2026-09-30]. https://www.moa.gov.cn/ztzl/zhnyzxd/zcfg/bmzc/202411/P020241118521358279211.pdf.</w:t>
+        <w:t xml:space="preserve">MALCHE T, JOSHI M, UPADHYAY G M, et al. Automated tomato leaf disease detection and alert system using Internet of Things and TinyML[J]. Discover Internet of Things, 2026, 6: 8. DOI:10.1007/s43926-025-00257-8.</w:t>
       </w:r>
     </w:p>
     <w:p>
@@ -10652,7 +10061,7 @@
           <w:sz w:val="20"/>
           <w:szCs w:val="20"/>
         </w:rPr>
-        <w:t xml:space="preserve">USDA National Agricultural Statistics Service. Technology use (farm computer usage and ownership)[R/OL]. (2025-08-01)[2026-09-30]. https://www.nass.usda.gov/Publications/Todays_Reports/reports/fmpc0825.pdf.</w:t>
+        <w:t xml:space="preserve">NYAKURI J P, NKUNDINEZA C, GATERA O, et al. AI and IoT-powered edge device optimized for crop pest and disease detection[J]. Scientific Reports, 2025, 15: 22905. DOI:10.1038/s41598-025-06452-5.</w:t>
       </w:r>
     </w:p>
     <w:p>
@@ -10673,7 +10082,7 @@
           <w:sz w:val="20"/>
           <w:szCs w:val="20"/>
         </w:rPr>
-        <w:t xml:space="preserve">John Deere. See &amp; Spray™ customers see 59% average herbicide savings in 2024[EB/OL]. (2024-09-18)[2026-09-30]. https://www.deere.com/en-us/john-deere-news/see-spray-59-percent-herbicide-savings.</w:t>
+        <w:t xml:space="preserve">SUN J, FENG Z, HAN J, et al. YOLO-PLNet: a lightweight real-time detection model for peanut leaf diseases based on edge deployment[J]. Frontiers in Plant Science, 2025, 16: 1707501. DOI:10.3389/fpls.2025.1707501.</w:t>
       </w:r>
     </w:p>
     <w:p>
@@ -10694,7 +10103,7 @@
           <w:sz w:val="20"/>
           <w:szCs w:val="20"/>
         </w:rPr>
-        <w:t xml:space="preserve">The Things Network. EU868 regional parameters[EB/OL]. [2026-09-30]. https://www.thethingsnetwork.org/docs/lorawan/regional-parameters/eu868/.</w:t>
+        <w:t xml:space="preserve">HAN S, MAO H, DALLY W J. Deep compression: compressing deep neural networks with pruning, trained quantization and Huffman coding[C]//International Conference on Learning Representations (ICLR 2016). 2016. arXiv:1510.00149.</w:t>
       </w:r>
     </w:p>
     <w:p>
@@ -10715,7 +10124,7 @@
           <w:sz w:val="20"/>
           <w:szCs w:val="20"/>
         </w:rPr>
-        <w:t xml:space="preserve">GONG R, ZHANG H, LI G, et al. Edge computing-enabled smart agriculture: technical architectures, practical evolution, and bottleneck breakthroughs[J]. Sensors, 2025, 25(17): 5302. DOI:10.3390/s25175302.</w:t>
+        <w:t xml:space="preserve">HOWARD A, SANDLER M, CHU G, et al. Searching for MobileNetV3[C]//2019 IEEE/CVF International Conference on Computer Vision (ICCV). 2019: 1314-1324. DOI:10.1109/ICCV.2019.00140.</w:t>
       </w:r>
     </w:p>
     <w:p>
@@ -10736,7 +10145,7 @@
           <w:sz w:val="20"/>
           <w:szCs w:val="20"/>
         </w:rPr>
-        <w:t xml:space="preserve">PINTUS M, COLUCCI F, MAGGIO F. Emerging developments in real-time edge AIoT for agricultural image classification[J]. IoT, 2025, 6(1): 13. DOI:10.3390/iot6010013.</w:t>
+        <w:t xml:space="preserve">LIN J, CHEN W M, LIN Y, et al. MCUNet: tiny deep learning on IoT devices[C]//Advances in Neural Information Processing Systems 33 (NeurIPS 2020). 2020: 11711-11722.</w:t>
       </w:r>
     </w:p>
     <w:p>
@@ -10757,7 +10166,7 @@
           <w:sz w:val="20"/>
           <w:szCs w:val="20"/>
         </w:rPr>
-        <w:t xml:space="preserve">YU P, TENG F, ZHU W, et al. Cloud–edge–device collaborative computing in smart agriculture: architectures, applications, and future perspectives[J]. Frontiers in Plant Science, 2025, 16: 1668545. DOI:10.3389/fpls.2025.1668545.</w:t>
+        <w:t xml:space="preserve">WANG K, GUO S, YANG X, et al. An integrated edge AI prototype for smart agriculture: real-time pest detection, physical trapping, and multi-node deployment analysis under field uncertainty[J]. Frontiers in Plant Science, 2026, 17: 1853368. DOI:10.3389/fpls.2026.1853368.</w:t>
       </w:r>
     </w:p>
     <w:p>
@@ -10778,7 +10187,7 @@
           <w:sz w:val="20"/>
           <w:szCs w:val="20"/>
         </w:rPr>
-        <w:t xml:space="preserve">赵春江. 农业知识智能服务技术综述[J]. 智慧农业(中英文), 2023, 5(2): 126-148. DOI:10.12133/j.smartag.SA202306002.</w:t>
+        <w:t xml:space="preserve">ŽALIK K R, ŽALIK M. A review of federated learning in agriculture[J]. Sensors, 2023, 23(23): 9566. DOI:10.3390/s23239566.</w:t>
       </w:r>
     </w:p>
     <w:p>
@@ -10799,7 +10208,7 @@
           <w:sz w:val="20"/>
           <w:szCs w:val="20"/>
         </w:rPr>
-        <w:t xml:space="preserve">IDC. New IDC spending guide forecasts edge computing investments will reach $232 billion in 2024[EB/OL]. Business Wire, (2024-03-14)[2026-09-30]. https://www.businesswire.com/news/home/20240314632794/en/.</w:t>
+        <w:t xml:space="preserve">夏雪, 柴秀娟, 张凝, 等. 用于边缘计算设备的果树挂果量轻量化估测模型[J]. 智慧农业(中英文), 2023, 5(2): 1-12. DOI:10.12133/j.smartag.SA202305004.</w:t>
       </w:r>
     </w:p>
     <w:p>
@@ -10820,7 +10229,7 @@
           <w:sz w:val="20"/>
           <w:szCs w:val="20"/>
         </w:rPr>
-        <w:t xml:space="preserve">Espressif Systems. ESP32-S3[EB/OL]. [2026-09-30]. https://www.espressif.com/en/products/socs/esp32-s3/.</w:t>
+        <w:t xml:space="preserve">LIU X, TENG W, YU H, et al. GAE-YOLO: a lightweight multimodal detection framework for tomato smart agriculture with edge computing[J]. Frontiers in Plant Science, 2025, 16: 1712432. DOI:10.3389/fpls.2025.1712432.</w:t>
       </w:r>
     </w:p>
     <w:p>
@@ -10841,7 +10250,7 @@
           <w:sz w:val="20"/>
           <w:szCs w:val="20"/>
         </w:rPr>
-        <w:t xml:space="preserve">STMicroelectronics. STM32N657X0[EB/OL]. [2026-09-30]. https://www.st.com.cn/zh/microcontrollers-microprocessors/stm32n657x0.html.</w:t>
+        <w:t xml:space="preserve">YU R, XIE Y, WANG R, et al. Hybrid LSTM-edge correction architecture for physics-informed crop health monitoring in distributed agricultural robotics[J]. Frontiers in Agronomy, 2026, 8: 1764002. DOI:10.3389/fagro.2026.1764002.</w:t>
       </w:r>
     </w:p>
     <w:p>
@@ -10856,783 +10265,6 @@
           <w:szCs w:val="20"/>
         </w:rPr>
         <w:t xml:space="preserve">[16] </w:t>
-      </w:r>
-      <w:r>
-        <w:rPr>
-          <w:sz w:val="20"/>
-          <w:szCs w:val="20"/>
-        </w:rPr>
-        <w:t xml:space="preserve">STMicroelectronics. STM32N6: ST's first MCU with Neural-ART Accelerator[EB/OL]. (2024-12-10)[2026-09-30]. https://blog.st.com/stm32n6/.</w:t>
-      </w:r>
-    </w:p>
-    <w:p>
-      <w:pPr>
-        <w:spacing w:after="40" w:before="0" w:line="300" w:lineRule="exact"/>
-        <w:ind w:left="460" w:hanging="460"/>
-        <w:jc w:val="left"/>
-      </w:pPr>
-      <w:r>
-        <w:rPr>
-          <w:sz w:val="20"/>
-          <w:szCs w:val="20"/>
-        </w:rPr>
-        <w:t xml:space="preserve">[17] </w:t>
-      </w:r>
-      <w:r>
-        <w:rPr>
-          <w:sz w:val="20"/>
-          <w:szCs w:val="20"/>
-        </w:rPr>
-        <w:t xml:space="preserve">NXP Semiconductors. i.MX 93 applications processor family[EB/OL]. [2026-09-30]. https://www.nxp.com/products/i.MX93.</w:t>
-      </w:r>
-    </w:p>
-    <w:p>
-      <w:pPr>
-        <w:spacing w:after="40" w:before="0" w:line="300" w:lineRule="exact"/>
-        <w:ind w:left="460" w:hanging="460"/>
-        <w:jc w:val="left"/>
-      </w:pPr>
-      <w:r>
-        <w:rPr>
-          <w:sz w:val="20"/>
-          <w:szCs w:val="20"/>
-        </w:rPr>
-        <w:t xml:space="preserve">[18] </w:t>
-      </w:r>
-      <w:r>
-        <w:rPr>
-          <w:sz w:val="20"/>
-          <w:szCs w:val="20"/>
-        </w:rPr>
-        <w:t xml:space="preserve">Rockchip. RK3588[EB/OL]. [2026-09-30]. https://www.rock-chips.com/a/en/products/RK35_Series/2022/0926/1660.html.</w:t>
-      </w:r>
-    </w:p>
-    <w:p>
-      <w:pPr>
-        <w:spacing w:after="40" w:before="0" w:line="300" w:lineRule="exact"/>
-        <w:ind w:left="460" w:hanging="460"/>
-        <w:jc w:val="left"/>
-      </w:pPr>
-      <w:r>
-        <w:rPr>
-          <w:sz w:val="20"/>
-          <w:szCs w:val="20"/>
-        </w:rPr>
-        <w:t xml:space="preserve">[19] </w:t>
-      </w:r>
-      <w:r>
-        <w:rPr>
-          <w:sz w:val="20"/>
-          <w:szCs w:val="20"/>
-        </w:rPr>
-        <w:t xml:space="preserve">Raspberry Pi Ltd. Raspberry Pi 5[EB/OL]. [2026-09-30]. https://www.raspberrypi.com/products/raspberry-pi-5/.</w:t>
-      </w:r>
-    </w:p>
-    <w:p>
-      <w:pPr>
-        <w:spacing w:after="40" w:before="0" w:line="300" w:lineRule="exact"/>
-        <w:ind w:left="460" w:hanging="460"/>
-        <w:jc w:val="left"/>
-      </w:pPr>
-      <w:r>
-        <w:rPr>
-          <w:sz w:val="20"/>
-          <w:szCs w:val="20"/>
-        </w:rPr>
-        <w:t xml:space="preserve">[20] </w:t>
-      </w:r>
-      <w:r>
-        <w:rPr>
-          <w:sz w:val="20"/>
-          <w:szCs w:val="20"/>
-        </w:rPr>
-        <w:t xml:space="preserve">NVIDIA. Jetson Orin NX series modules data sheet[EB/OL]. [2026-09-30]. https://developer.nvidia.com/downloads/jetson-orin-nx-module-series-data-sheet.</w:t>
-      </w:r>
-    </w:p>
-    <w:p>
-      <w:pPr>
-        <w:spacing w:after="40" w:before="0" w:line="300" w:lineRule="exact"/>
-        <w:ind w:left="460" w:hanging="460"/>
-        <w:jc w:val="left"/>
-      </w:pPr>
-      <w:r>
-        <w:rPr>
-          <w:sz w:val="20"/>
-          <w:szCs w:val="20"/>
-        </w:rPr>
-        <w:t xml:space="preserve">[21] </w:t>
-      </w:r>
-      <w:r>
-        <w:rPr>
-          <w:sz w:val="20"/>
-          <w:szCs w:val="20"/>
-        </w:rPr>
-        <w:t xml:space="preserve">NVIDIA. Jetson Orin Nano Super developer kit[EB/OL]. [2026-09-30]. https://www.nvidia.com/en-sg/autonomous-machines/embedded-systems/jetson-orin/nano-super-developer-kit/.</w:t>
-      </w:r>
-    </w:p>
-    <w:p>
-      <w:pPr>
-        <w:spacing w:after="40" w:before="0" w:line="300" w:lineRule="exact"/>
-        <w:ind w:left="460" w:hanging="460"/>
-        <w:jc w:val="left"/>
-      </w:pPr>
-      <w:r>
-        <w:rPr>
-          <w:sz w:val="20"/>
-          <w:szCs w:val="20"/>
-        </w:rPr>
-        <w:t xml:space="preserve">[22] </w:t>
-      </w:r>
-      <w:r>
-        <w:rPr>
-          <w:sz w:val="20"/>
-          <w:szCs w:val="20"/>
-        </w:rPr>
-        <w:t xml:space="preserve">SU C. NVIDIA unveils its most affordable generative AI supercomputer[EB/OL]. NVIDIA Blog, (2024-12-17)[2026-09-30]. https://blogs.nvidia.com/blog/jetson-generative-ai-supercomputer/.</w:t>
-      </w:r>
-    </w:p>
-    <w:p>
-      <w:pPr>
-        <w:spacing w:after="40" w:before="0" w:line="300" w:lineRule="exact"/>
-        <w:ind w:left="460" w:hanging="460"/>
-        <w:jc w:val="left"/>
-      </w:pPr>
-      <w:r>
-        <w:rPr>
-          <w:sz w:val="20"/>
-          <w:szCs w:val="20"/>
-        </w:rPr>
-        <w:t xml:space="preserve">[23] </w:t>
-      </w:r>
-      <w:r>
-        <w:rPr>
-          <w:sz w:val="20"/>
-          <w:szCs w:val="20"/>
-        </w:rPr>
-        <w:t xml:space="preserve">Hailo. Hailo-8L product brief[EB/OL]. [2026-09-30]. https://hailo.ai/wp-content/uploads/2024/02/hailo8l_product_brief_1.2.pdf.</w:t>
-      </w:r>
-    </w:p>
-    <w:p>
-      <w:pPr>
-        <w:spacing w:after="40" w:before="0" w:line="300" w:lineRule="exact"/>
-        <w:ind w:left="460" w:hanging="460"/>
-        <w:jc w:val="left"/>
-      </w:pPr>
-      <w:r>
-        <w:rPr>
-          <w:sz w:val="20"/>
-          <w:szCs w:val="20"/>
-        </w:rPr>
-        <w:t xml:space="preserve">[24] </w:t>
-      </w:r>
-      <w:r>
-        <w:rPr>
-          <w:sz w:val="20"/>
-          <w:szCs w:val="20"/>
-        </w:rPr>
-        <w:t xml:space="preserve">SALEM M A, RABIA A H. Enabling scalable and energy-efficient weed detection using data-driven edge AI for precision agriculture[J]. Frontiers in Agronomy, 2026, 8: 1808404. DOI:10.3389/fagro.2026.1808404.</w:t>
-      </w:r>
-    </w:p>
-    <w:p>
-      <w:pPr>
-        <w:spacing w:after="40" w:before="0" w:line="300" w:lineRule="exact"/>
-        <w:ind w:left="460" w:hanging="460"/>
-        <w:jc w:val="left"/>
-      </w:pPr>
-      <w:r>
-        <w:rPr>
-          <w:sz w:val="20"/>
-          <w:szCs w:val="20"/>
-        </w:rPr>
-        <w:t xml:space="preserve">[25] </w:t>
-      </w:r>
-      <w:r>
-        <w:rPr>
-          <w:sz w:val="20"/>
-          <w:szCs w:val="20"/>
-        </w:rPr>
-        <w:t xml:space="preserve">MALCHE T, JOSHI M, UPADHYAY G M, et al. Automated tomato leaf disease detection and alert system using Internet of Things and TinyML[J]. Discover Internet of Things, 2026, 6: 8. DOI:10.1007/s43926-025-00257-8.</w:t>
-      </w:r>
-    </w:p>
-    <w:p>
-      <w:pPr>
-        <w:spacing w:after="40" w:before="0" w:line="300" w:lineRule="exact"/>
-        <w:ind w:left="460" w:hanging="460"/>
-        <w:jc w:val="left"/>
-      </w:pPr>
-      <w:r>
-        <w:rPr>
-          <w:sz w:val="20"/>
-          <w:szCs w:val="20"/>
-        </w:rPr>
-        <w:t xml:space="preserve">[26] </w:t>
-      </w:r>
-      <w:r>
-        <w:rPr>
-          <w:sz w:val="20"/>
-          <w:szCs w:val="20"/>
-        </w:rPr>
-        <w:t xml:space="preserve">NYAKURI J P, NKUNDINEZA C, GATERA O, et al. AI and IoT-powered edge device optimized for crop pest and disease detection[J]. Scientific Reports, 2025, 15: 22905. DOI:10.1038/s41598-025-06452-5.</w:t>
-      </w:r>
-    </w:p>
-    <w:p>
-      <w:pPr>
-        <w:spacing w:after="40" w:before="0" w:line="300" w:lineRule="exact"/>
-        <w:ind w:left="460" w:hanging="460"/>
-        <w:jc w:val="left"/>
-      </w:pPr>
-      <w:r>
-        <w:rPr>
-          <w:sz w:val="20"/>
-          <w:szCs w:val="20"/>
-        </w:rPr>
-        <w:t xml:space="preserve">[27] </w:t>
-      </w:r>
-      <w:r>
-        <w:rPr>
-          <w:sz w:val="20"/>
-          <w:szCs w:val="20"/>
-        </w:rPr>
-        <w:t xml:space="preserve">SUN J, FENG Z, HAN J, et al. YOLO-PLNet: a lightweight real-time detection model for peanut leaf diseases based on edge deployment[J]. Frontiers in Plant Science, 2025, 16: 1707501. DOI:10.3389/fpls.2025.1707501.</w:t>
-      </w:r>
-    </w:p>
-    <w:p>
-      <w:pPr>
-        <w:spacing w:after="40" w:before="0" w:line="300" w:lineRule="exact"/>
-        <w:ind w:left="460" w:hanging="460"/>
-        <w:jc w:val="left"/>
-      </w:pPr>
-      <w:r>
-        <w:rPr>
-          <w:sz w:val="20"/>
-          <w:szCs w:val="20"/>
-        </w:rPr>
-        <w:t xml:space="preserve">[28] </w:t>
-      </w:r>
-      <w:r>
-        <w:rPr>
-          <w:sz w:val="20"/>
-          <w:szCs w:val="20"/>
-        </w:rPr>
-        <w:t xml:space="preserve">JACOB B, KLIGYS S, CHEN B, et al. Quantization and training of neural networks for efficient integer-arithmetic-only inference[C]//2018 IEEE/CVF Conference on Computer Vision and Pattern Recognition (CVPR). 2018: 2704-2713. DOI:10.1109/CVPR.2018.00286.</w:t>
-      </w:r>
-    </w:p>
-    <w:p>
-      <w:pPr>
-        <w:spacing w:after="40" w:before="0" w:line="300" w:lineRule="exact"/>
-        <w:ind w:left="460" w:hanging="460"/>
-        <w:jc w:val="left"/>
-      </w:pPr>
-      <w:r>
-        <w:rPr>
-          <w:sz w:val="20"/>
-          <w:szCs w:val="20"/>
-        </w:rPr>
-        <w:t xml:space="preserve">[29] </w:t>
-      </w:r>
-      <w:r>
-        <w:rPr>
-          <w:sz w:val="20"/>
-          <w:szCs w:val="20"/>
-        </w:rPr>
-        <w:t xml:space="preserve">HAN S, MAO H, DALLY W J. Deep compression: compressing deep neural networks with pruning, trained quantization and Huffman coding[C]//International Conference on Learning Representations (ICLR 2016). 2016. arXiv:1510.00149.</w:t>
-      </w:r>
-    </w:p>
-    <w:p>
-      <w:pPr>
-        <w:spacing w:after="40" w:before="0" w:line="300" w:lineRule="exact"/>
-        <w:ind w:left="460" w:hanging="460"/>
-        <w:jc w:val="left"/>
-      </w:pPr>
-      <w:r>
-        <w:rPr>
-          <w:sz w:val="20"/>
-          <w:szCs w:val="20"/>
-        </w:rPr>
-        <w:t xml:space="preserve">[30] </w:t>
-      </w:r>
-      <w:r>
-        <w:rPr>
-          <w:sz w:val="20"/>
-          <w:szCs w:val="20"/>
-        </w:rPr>
-        <w:t xml:space="preserve">HINTON G, VINYALS O, DEAN J. Distilling the knowledge in a neural network[EB/OL]. (2015-03-09)[2026-09-30]. https://arxiv.org/abs/1503.02531.</w:t>
-      </w:r>
-    </w:p>
-    <w:p>
-      <w:pPr>
-        <w:spacing w:after="40" w:before="0" w:line="300" w:lineRule="exact"/>
-        <w:ind w:left="460" w:hanging="460"/>
-        <w:jc w:val="left"/>
-      </w:pPr>
-      <w:r>
-        <w:rPr>
-          <w:sz w:val="20"/>
-          <w:szCs w:val="20"/>
-        </w:rPr>
-        <w:t xml:space="preserve">[31] </w:t>
-      </w:r>
-      <w:r>
-        <w:rPr>
-          <w:sz w:val="20"/>
-          <w:szCs w:val="20"/>
-        </w:rPr>
-        <w:t xml:space="preserve">HOWARD A, SANDLER M, CHU G, et al. Searching for MobileNetV3[C]//2019 IEEE/CVF International Conference on Computer Vision (ICCV). 2019: 1314-1324. DOI:10.1109/ICCV.2019.00140.</w:t>
-      </w:r>
-    </w:p>
-    <w:p>
-      <w:pPr>
-        <w:spacing w:after="40" w:before="0" w:line="300" w:lineRule="exact"/>
-        <w:ind w:left="460" w:hanging="460"/>
-        <w:jc w:val="left"/>
-      </w:pPr>
-      <w:r>
-        <w:rPr>
-          <w:sz w:val="20"/>
-          <w:szCs w:val="20"/>
-        </w:rPr>
-        <w:t xml:space="preserve">[32] </w:t>
-      </w:r>
-      <w:r>
-        <w:rPr>
-          <w:sz w:val="20"/>
-          <w:szCs w:val="20"/>
-        </w:rPr>
-        <w:t xml:space="preserve">LIN J, CHEN W M, LIN Y, et al. MCUNet: tiny deep learning on IoT devices[C]//Advances in Neural Information Processing Systems 33 (NeurIPS 2020). 2020: 11711-11722.</w:t>
-      </w:r>
-    </w:p>
-    <w:p>
-      <w:pPr>
-        <w:spacing w:after="40" w:before="0" w:line="300" w:lineRule="exact"/>
-        <w:ind w:left="460" w:hanging="460"/>
-        <w:jc w:val="left"/>
-      </w:pPr>
-      <w:r>
-        <w:rPr>
-          <w:sz w:val="20"/>
-          <w:szCs w:val="20"/>
-        </w:rPr>
-        <w:t xml:space="preserve">[33] </w:t>
-      </w:r>
-      <w:r>
-        <w:rPr>
-          <w:sz w:val="20"/>
-          <w:szCs w:val="20"/>
-        </w:rPr>
-        <w:t xml:space="preserve">WANG K, GUO S, YANG X, et al. An integrated edge AI prototype for smart agriculture: real-time pest detection, physical trapping, and multi-node deployment analysis under field uncertainty[J]. Frontiers in Plant Science, 2026, 17: 1853368. DOI:10.3389/fpls.2026.1853368.</w:t>
-      </w:r>
-    </w:p>
-    <w:p>
-      <w:pPr>
-        <w:spacing w:after="40" w:before="0" w:line="300" w:lineRule="exact"/>
-        <w:ind w:left="460" w:hanging="460"/>
-        <w:jc w:val="left"/>
-      </w:pPr>
-      <w:r>
-        <w:rPr>
-          <w:sz w:val="20"/>
-          <w:szCs w:val="20"/>
-        </w:rPr>
-        <w:t xml:space="preserve">[34] </w:t>
-      </w:r>
-      <w:r>
-        <w:rPr>
-          <w:sz w:val="20"/>
-          <w:szCs w:val="20"/>
-        </w:rPr>
-        <w:t xml:space="preserve">Google. LiteRT for Microcontrollers[EB/OL]. [2026-09-30]. https://developers.google.com/edge/litert/microcontrollers/overview.</w:t>
-      </w:r>
-    </w:p>
-    <w:p>
-      <w:pPr>
-        <w:spacing w:after="40" w:before="0" w:line="300" w:lineRule="exact"/>
-        <w:ind w:left="460" w:hanging="460"/>
-        <w:jc w:val="left"/>
-      </w:pPr>
-      <w:r>
-        <w:rPr>
-          <w:sz w:val="20"/>
-          <w:szCs w:val="20"/>
-        </w:rPr>
-        <w:t xml:space="preserve">[35] </w:t>
-      </w:r>
-      <w:r>
-        <w:rPr>
-          <w:sz w:val="20"/>
-          <w:szCs w:val="20"/>
-        </w:rPr>
-        <w:t xml:space="preserve">Arm. CMSIS-NN documentation[EB/OL]. [2026-09-30]. https://arm-software.github.io/CMSIS-NN/latest/.</w:t>
-      </w:r>
-    </w:p>
-    <w:p>
-      <w:pPr>
-        <w:spacing w:after="40" w:before="0" w:line="300" w:lineRule="exact"/>
-        <w:ind w:left="460" w:hanging="460"/>
-        <w:jc w:val="left"/>
-      </w:pPr>
-      <w:r>
-        <w:rPr>
-          <w:sz w:val="20"/>
-          <w:szCs w:val="20"/>
-        </w:rPr>
-        <w:t xml:space="preserve">[36] </w:t>
-      </w:r>
-      <w:r>
-        <w:rPr>
-          <w:sz w:val="20"/>
-          <w:szCs w:val="20"/>
-        </w:rPr>
-        <w:t xml:space="preserve">ONNX Runtime. Execution providers[EB/OL]. [2026-09-30]. https://onnxruntime.ai/docs/execution-providers/.</w:t>
-      </w:r>
-    </w:p>
-    <w:p>
-      <w:pPr>
-        <w:spacing w:after="40" w:before="0" w:line="300" w:lineRule="exact"/>
-        <w:ind w:left="460" w:hanging="460"/>
-        <w:jc w:val="left"/>
-      </w:pPr>
-      <w:r>
-        <w:rPr>
-          <w:sz w:val="20"/>
-          <w:szCs w:val="20"/>
-        </w:rPr>
-        <w:t xml:space="preserve">[37] </w:t>
-      </w:r>
-      <w:r>
-        <w:rPr>
-          <w:sz w:val="20"/>
-          <w:szCs w:val="20"/>
-        </w:rPr>
-        <w:t xml:space="preserve">NVIDIA. Working with quantized types: TensorRT documentation[EB/OL]. [2026-09-30]. https://docs.nvidia.com/deeplearning/tensorrt/latest/inference-library/work-with-quantized-types.html.</w:t>
-      </w:r>
-    </w:p>
-    <w:p>
-      <w:pPr>
-        <w:spacing w:after="40" w:before="0" w:line="300" w:lineRule="exact"/>
-        <w:ind w:left="460" w:hanging="460"/>
-        <w:jc w:val="left"/>
-      </w:pPr>
-      <w:r>
-        <w:rPr>
-          <w:sz w:val="20"/>
-          <w:szCs w:val="20"/>
-        </w:rPr>
-        <w:t xml:space="preserve">[38] </w:t>
-      </w:r>
-      <w:r>
-        <w:rPr>
-          <w:sz w:val="20"/>
-          <w:szCs w:val="20"/>
-        </w:rPr>
-        <w:t xml:space="preserve">Intel. Running inference: OpenVINO 2025 documentation[EB/OL]. [2026-09-30]. https://docs.openvino.ai/2025/openvino-workflow/running-inference.html.</w:t>
-      </w:r>
-    </w:p>
-    <w:p>
-      <w:pPr>
-        <w:spacing w:after="40" w:before="0" w:line="300" w:lineRule="exact"/>
-        <w:ind w:left="460" w:hanging="460"/>
-        <w:jc w:val="left"/>
-      </w:pPr>
-      <w:r>
-        <w:rPr>
-          <w:sz w:val="20"/>
-          <w:szCs w:val="20"/>
-        </w:rPr>
-        <w:t xml:space="preserve">[39] </w:t>
-      </w:r>
-      <w:r>
-        <w:rPr>
-          <w:sz w:val="20"/>
-          <w:szCs w:val="20"/>
-        </w:rPr>
-        <w:t xml:space="preserve">Espressif Systems. ESP-IDF programming guide: over the air updates (OTA), ESP32-S3[EB/OL]. [2026-09-30]. https://docs.espressif.com/projects/esp-idf/en/stable/esp32s3/api-reference/system/ota.html.</w:t>
-      </w:r>
-    </w:p>
-    <w:p>
-      <w:pPr>
-        <w:spacing w:after="40" w:before="0" w:line="300" w:lineRule="exact"/>
-        <w:ind w:left="460" w:hanging="460"/>
-        <w:jc w:val="left"/>
-      </w:pPr>
-      <w:r>
-        <w:rPr>
-          <w:sz w:val="20"/>
-          <w:szCs w:val="20"/>
-        </w:rPr>
-        <w:t xml:space="preserve">[40] </w:t>
-      </w:r>
-      <w:r>
-        <w:rPr>
-          <w:sz w:val="20"/>
-          <w:szCs w:val="20"/>
-        </w:rPr>
-        <w:t xml:space="preserve">Espressif Systems. ESP-IDF programming guide: FreeRTOS (IDF), ESP32-S3[EB/OL]. [2026-09-30]. https://docs.espressif.com/projects/esp-idf/en/stable/esp32s3/api-reference/system/freertos_idf.html.</w:t>
-      </w:r>
-    </w:p>
-    <w:p>
-      <w:pPr>
-        <w:spacing w:after="40" w:before="0" w:line="300" w:lineRule="exact"/>
-        <w:ind w:left="460" w:hanging="460"/>
-        <w:jc w:val="left"/>
-      </w:pPr>
-      <w:r>
-        <w:rPr>
-          <w:sz w:val="20"/>
-          <w:szCs w:val="20"/>
-        </w:rPr>
-        <w:t xml:space="preserve">[41] </w:t>
-      </w:r>
-      <w:r>
-        <w:rPr>
-          <w:sz w:val="20"/>
-          <w:szCs w:val="20"/>
-        </w:rPr>
-        <w:t xml:space="preserve">FAGAN M, MEGAS K N, SCARFONE K, et al. IoT device cybersecurity capability core baseline: NISTIR 8259A[R]. Gaithersburg: National Institute of Standards and Technology, 2020. DOI:10.6028/NIST.IR.8259A.</w:t>
-      </w:r>
-    </w:p>
-    <w:p>
-      <w:pPr>
-        <w:spacing w:after="40" w:before="0" w:line="300" w:lineRule="exact"/>
-        <w:ind w:left="460" w:hanging="460"/>
-        <w:jc w:val="left"/>
-      </w:pPr>
-      <w:r>
-        <w:rPr>
-          <w:sz w:val="20"/>
-          <w:szCs w:val="20"/>
-        </w:rPr>
-        <w:t xml:space="preserve">[42] </w:t>
-      </w:r>
-      <w:r>
-        <w:rPr>
-          <w:sz w:val="20"/>
-          <w:szCs w:val="20"/>
-        </w:rPr>
-        <w:t xml:space="preserve">ŽALIK K R, ŽALIK M. A review of federated learning in agriculture[J]. Sensors, 2023, 23(23): 9566. DOI:10.3390/s23239566.</w:t>
-      </w:r>
-    </w:p>
-    <w:p>
-      <w:pPr>
-        <w:spacing w:after="40" w:before="0" w:line="300" w:lineRule="exact"/>
-        <w:ind w:left="460" w:hanging="460"/>
-        <w:jc w:val="left"/>
-      </w:pPr>
-      <w:r>
-        <w:rPr>
-          <w:sz w:val="20"/>
-          <w:szCs w:val="20"/>
-        </w:rPr>
-        <w:t xml:space="preserve">[43] </w:t>
-      </w:r>
-      <w:r>
-        <w:rPr>
-          <w:sz w:val="20"/>
-          <w:szCs w:val="20"/>
-        </w:rPr>
-        <w:t xml:space="preserve">夏雪, 柴秀娟, 张凝, 等. 用于边缘计算设备的果树挂果量轻量化估测模型[J]. 智慧农业(中英文), 2023, 5(2): 1-12. DOI:10.12133/j.smartag.SA202305004.</w:t>
-      </w:r>
-    </w:p>
-    <w:p>
-      <w:pPr>
-        <w:spacing w:after="40" w:before="0" w:line="300" w:lineRule="exact"/>
-        <w:ind w:left="460" w:hanging="460"/>
-        <w:jc w:val="left"/>
-      </w:pPr>
-      <w:r>
-        <w:rPr>
-          <w:sz w:val="20"/>
-          <w:szCs w:val="20"/>
-        </w:rPr>
-        <w:t xml:space="preserve">[44] </w:t>
-      </w:r>
-      <w:r>
-        <w:rPr>
-          <w:sz w:val="20"/>
-          <w:szCs w:val="20"/>
-        </w:rPr>
-        <w:t xml:space="preserve">LIU X, TENG W, YU H, et al. GAE-YOLO: a lightweight multimodal detection framework for tomato smart agriculture with edge computing[J]. Frontiers in Plant Science, 2025, 16: 1712432. DOI:10.3389/fpls.2025.1712432.</w:t>
-      </w:r>
-    </w:p>
-    <w:p>
-      <w:pPr>
-        <w:spacing w:after="40" w:before="0" w:line="300" w:lineRule="exact"/>
-        <w:ind w:left="460" w:hanging="460"/>
-        <w:jc w:val="left"/>
-      </w:pPr>
-      <w:r>
-        <w:rPr>
-          <w:sz w:val="20"/>
-          <w:szCs w:val="20"/>
-        </w:rPr>
-        <w:t xml:space="preserve">[45] </w:t>
-      </w:r>
-      <w:r>
-        <w:rPr>
-          <w:sz w:val="20"/>
-          <w:szCs w:val="20"/>
-        </w:rPr>
-        <w:t xml:space="preserve">YU R, XIE Y, WANG R, et al. Hybrid LSTM-edge correction architecture for physics-informed crop health monitoring in distributed agricultural robotics[J]. Frontiers in Agronomy, 2026, 8: 1764002. DOI:10.3389/fagro.2026.1764002.</w:t>
-      </w:r>
-    </w:p>
-    <w:p>
-      <w:pPr>
-        <w:spacing w:after="40" w:before="0" w:line="300" w:lineRule="exact"/>
-        <w:ind w:left="460" w:hanging="460"/>
-        <w:jc w:val="left"/>
-      </w:pPr>
-      <w:r>
-        <w:rPr>
-          <w:sz w:val="20"/>
-          <w:szCs w:val="20"/>
-        </w:rPr>
-        <w:t xml:space="preserve">[46] </w:t>
-      </w:r>
-      <w:r>
-        <w:rPr>
-          <w:sz w:val="20"/>
-          <w:szCs w:val="20"/>
-        </w:rPr>
-        <w:t xml:space="preserve">Carbon Robotics. LaserWeeder G2 600[EB/OL]. [2026-09-30]. https://carbonrobotics.com/laserweeder-g2-600.</w:t>
-      </w:r>
-    </w:p>
-    <w:p>
-      <w:pPr>
-        <w:spacing w:after="40" w:before="0" w:line="300" w:lineRule="exact"/>
-        <w:ind w:left="460" w:hanging="460"/>
-        <w:jc w:val="left"/>
-      </w:pPr>
-      <w:r>
-        <w:rPr>
-          <w:sz w:val="20"/>
-          <w:szCs w:val="20"/>
-        </w:rPr>
-        <w:t xml:space="preserve">[47] </w:t>
-      </w:r>
-      <w:r>
-        <w:rPr>
-          <w:sz w:val="20"/>
-          <w:szCs w:val="20"/>
-        </w:rPr>
-        <w:t xml:space="preserve">Carbon Robotics, NVIDIA. From farm to fork: how AI is transforming food safety[EB/OL]. [2026-09-30]. https://www.multivu.com/carbon-robotics/9391051-en-nvidia-and-carbon-robotics-revolutionizing-agriculture-with-ai-and-robotics.</w:t>
-      </w:r>
-    </w:p>
-    <w:p>
-      <w:pPr>
-        <w:spacing w:after="40" w:before="0" w:line="300" w:lineRule="exact"/>
-        <w:ind w:left="460" w:hanging="460"/>
-        <w:jc w:val="left"/>
-      </w:pPr>
-      <w:r>
-        <w:rPr>
-          <w:sz w:val="20"/>
-          <w:szCs w:val="20"/>
-        </w:rPr>
-        <w:t xml:space="preserve">[48] </w:t>
-      </w:r>
-      <w:r>
-        <w:rPr>
-          <w:sz w:val="20"/>
-          <w:szCs w:val="20"/>
-        </w:rPr>
-        <w:t xml:space="preserve">XAG. XAG P150 agricultural drone[EB/OL]. [2026-09-30]. https://www.xa.com/en/p150.</w:t>
-      </w:r>
-    </w:p>
-    <w:p>
-      <w:pPr>
-        <w:spacing w:after="40" w:before="0" w:line="300" w:lineRule="exact"/>
-        <w:ind w:left="460" w:hanging="460"/>
-        <w:jc w:val="left"/>
-      </w:pPr>
-      <w:r>
-        <w:rPr>
-          <w:sz w:val="20"/>
-          <w:szCs w:val="20"/>
-        </w:rPr>
-        <w:t xml:space="preserve">[49] </w:t>
-      </w:r>
-      <w:r>
-        <w:rPr>
-          <w:sz w:val="20"/>
-          <w:szCs w:val="20"/>
-        </w:rPr>
-        <w:t xml:space="preserve">DJI Agriculture. DJI Agriculture's annual report reveals drone-powered farming revolution at Brazil's Agrishow 2025[EB/OL]. (2025-05-06)[2026-09-30]. https://www.dji.com/media-center/announcements/dji-agricultural-annual-report-2025.</w:t>
-      </w:r>
-    </w:p>
-    <w:p>
-      <w:pPr>
-        <w:spacing w:after="40" w:before="0" w:line="300" w:lineRule="exact"/>
-        <w:ind w:left="460" w:hanging="460"/>
-        <w:jc w:val="left"/>
-      </w:pPr>
-      <w:r>
-        <w:rPr>
-          <w:sz w:val="20"/>
-          <w:szCs w:val="20"/>
-        </w:rPr>
-        <w:t xml:space="preserve">[50] </w:t>
-      </w:r>
-      <w:r>
-        <w:rPr>
-          <w:sz w:val="20"/>
-          <w:szCs w:val="20"/>
-        </w:rPr>
-        <w:t xml:space="preserve">ISO. Tractors and machinery for agriculture and forestry—Serial control and communications data network—Part 1: General standard for mobile data communication: ISO 11783-1:2017[S]. Geneva: ISO, 2017.</w:t>
-      </w:r>
-    </w:p>
-    <w:p>
-      <w:pPr>
-        <w:spacing w:after="40" w:before="0" w:line="300" w:lineRule="exact"/>
-        <w:ind w:left="460" w:hanging="460"/>
-        <w:jc w:val="left"/>
-      </w:pPr>
-      <w:r>
-        <w:rPr>
-          <w:sz w:val="20"/>
-          <w:szCs w:val="20"/>
-        </w:rPr>
-        <w:t xml:space="preserve">[51] </w:t>
-      </w:r>
-      <w:r>
-        <w:rPr>
-          <w:sz w:val="20"/>
-          <w:szCs w:val="20"/>
-        </w:rPr>
-        <w:t xml:space="preserve">ISO. Tractors and machinery for agriculture and forestry—Safety-related parts of control systems—Part 1: General principles for design and development: ISO 25119-1:2018[S]. Geneva: ISO, 2018.</w:t>
-      </w:r>
-    </w:p>
-    <w:p>
-      <w:pPr>
-        <w:spacing w:after="40" w:before="0" w:line="300" w:lineRule="exact"/>
-        <w:ind w:left="460" w:hanging="460"/>
-        <w:jc w:val="left"/>
-      </w:pPr>
-      <w:r>
-        <w:rPr>
-          <w:sz w:val="20"/>
-          <w:szCs w:val="20"/>
-        </w:rPr>
-        <w:t xml:space="preserve">[52] </w:t>
-      </w:r>
-      <w:r>
-        <w:rPr>
-          <w:sz w:val="20"/>
-          <w:szCs w:val="20"/>
-        </w:rPr>
-        <w:t xml:space="preserve">ISO. Agricultural machinery and tractors—Safety of partially automated, semi-autonomous and autonomous machinery—Part 1: Machine design principles and vocabulary: ISO 18497-1:2024[S]. Geneva: ISO, 2024.</w:t>
-      </w:r>
-    </w:p>
-    <w:p>
-      <w:pPr>
-        <w:spacing w:after="40" w:before="0" w:line="300" w:lineRule="exact"/>
-        <w:ind w:left="460" w:hanging="460"/>
-        <w:jc w:val="left"/>
-      </w:pPr>
-      <w:r>
-        <w:rPr>
-          <w:sz w:val="20"/>
-          <w:szCs w:val="20"/>
-        </w:rPr>
-        <w:t xml:space="preserve">[53] </w:t>
       </w:r>
       <w:r>
         <w:rPr>

</xml_diff>